<commit_message>
"Analisis nuevo con unión de clima"
</commit_message>
<xml_diff>
--- a/Meteorología y contaminación del aire en la ZMVM — Entrega 1.docx
+++ b/Meteorología y contaminación del aire en la ZMVM — Entrega 1.docx
@@ -7,7 +7,7 @@
         <w:pStyle w:val="Heading1"/>
       </w:pPr>
       <w:r>
-        <w:t xml:space="preserve">Meteorología y contaminación del aire en la ZMVM — Entrega 1</w:t>
+        <w:t xml:space="preserve">Contaminación del aire en la ZMVM: cuándo sube y quién la respira — Entrega 1</w:t>
       </w:r>
     </w:p>
     <w:p>
@@ -31,51 +31,7 @@
         <w:t xml:space="preserve">Analítica Avanzada · Proyecto, entrega 1.</w:t>
       </w:r>
       <w:r>
-        <w:t xml:space="preserve"> Con 10 años de mediciones horarias del SIMAT (2015-2024) armamos un dataset de 3,653 días × 37 variables. Hallazgos principales: la ZMVM rebasa la norma de ozono en 66% de los días, y la meteorología del día explica 59% de la variación del ozono en años que el modelo no vio (66% al agregar el valor del día anterior). Para PM2.5 se explica 54%.</w:t>
-      </w:r>
-    </w:p>
-    <w:p>
-      <w:pPr/>
-      <w:r>
-        <w:t xml:space="preserve">Notebook: </w:t>
-      </w:r>
-      <w:r>
-        <w:rPr>
-          <w:rStyle w:val="CodeChar"/>
-        </w:rPr>
-        <w:t xml:space="preserve">EDA_entrega1_RAMA.ipynb</w:t>
-      </w:r>
-      <w:r>
-        <w:t xml:space="preserve"> (corre en Google Colab y en local). Dataset: </w:t>
-      </w:r>
-      <w:r>
-        <w:rPr>
-          <w:rStyle w:val="CodeChar"/>
-        </w:rPr>
-        <w:t xml:space="preserve">datos/dataset_final_diario.csv</w:t>
-      </w:r>
-      <w:r>
-        <w:t xml:space="preserve">.</w:t>
-      </w:r>
-    </w:p>
-    <w:p>
-      <w:pPr>
-        <w:pStyle w:val="Heading2"/>
-      </w:pPr>
-      <w:r>
-        <w:t xml:space="preserve">1. Problemática a analizar</w:t>
-      </w:r>
-    </w:p>
-    <w:p>
-      <w:pPr/>
-      <w:r>
-        <w:t xml:space="preserve">La contaminación de la ZMVM sube y baja mucho de un día a otro, aunque las emisiones cambian poco; esa variación la controla sobre todo el clima. Hoy las contingencias se activan cuando el episodio ya está ocurriendo.</w:t>
-      </w:r>
-    </w:p>
-    <w:p>
-      <w:pPr/>
-      <w:r>
-        <w:t xml:space="preserve">Los dos contaminantes que más afectan la salud y que más contingencias provocan son:</w:t>
+        <w:t xml:space="preserve"> Unimos nuestro EDA anterior (Censo 2020, satélite y promedios por localidad) con 10 años de mediciones horarias del SIMAT (2015-2024). El resultado son dos datasets conectados por las estaciones: uno diario (3,653 días) y uno por localidad (5,085 localidades).</w:t>
       </w:r>
     </w:p>
     <w:p>
@@ -90,10 +46,10 @@
         <w:rPr>
           <w:b/>
         </w:rPr>
-        <w:t xml:space="preserve">Ozono (O3):</w:t>
-      </w:r>
-      <w:r>
-        <w:t xml:space="preserve"> no se emite directamente. Se forma en el aire cuando los óxidos de nitrógeno y los compuestos orgánicos de vehículos e industria reaccionan con la radiación solar, así que depende de la temperatura y la insolación.</w:t>
+        <w:t xml:space="preserve">Dataset diario:</w:t>
+      </w:r>
+      <w:r>
+        <w:t xml:space="preserve"> la meteorología del día explica el 59% de la variación del ozono en años que el modelo no vio (66% con el valor del día anterior) y el 54% del PM2.5.</w:t>
       </w:r>
     </w:p>
     <w:p>
@@ -108,34 +64,63 @@
         <w:rPr>
           <w:b/>
         </w:rPr>
-        <w:t xml:space="preserve">Partículas finas (PM2.5):</w:t>
-      </w:r>
-      <w:r>
-        <w:t xml:space="preserve"> vienen de la combustión (vehículos, incendios, quemas, pirotecnia). Se acumulan cuando el aire está estancado: poco viento y una inversión térmica.</w:t>
+        <w:t xml:space="preserve">Dataset por localidad:</w:t>
+      </w:r>
+      <w:r>
+        <w:t xml:space="preserve"> el satélite de NO2 coincide con las estaciones (ρ = 0.89) y el de PM2.5 no (ρ = 0.08). 4.45 millones de personas viven cerca de una estación con más de 120 días al año sobre la norma de ozono.</w:t>
       </w:r>
     </w:p>
     <w:p>
       <w:pPr/>
       <w:r>
-        <w:rPr>
-          <w:b/>
-        </w:rPr>
-        <w:t xml:space="preserve">Pregunta de investigación:</w:t>
-      </w:r>
-      <w:r>
-        <w:t xml:space="preserve"> ¿Qué tanto de la variación diaria de PM2.5 y ozono en la ZMVM se explica por la meteorología (temperatura, humedad, viento, estabilidad del aire) y el calendario? ¿Se puede anticipar un día que rebase la norma con información disponible el día anterior?</w:t>
+        <w:t xml:space="preserve">Notebook: </w:t>
+      </w:r>
+      <w:r>
+        <w:rPr>
+          <w:rStyle w:val="CodeChar"/>
+        </w:rPr>
+        <w:t xml:space="preserve">EDA_entrega1.ipynb</w:t>
+      </w:r>
+      <w:r>
+        <w:t xml:space="preserve"> (corre en Google Colab y en local). Datasets: </w:t>
+      </w:r>
+      <w:r>
+        <w:rPr>
+          <w:rStyle w:val="CodeChar"/>
+        </w:rPr>
+        <w:t xml:space="preserve">datos/dataset_final_diario.csv</w:t>
+      </w:r>
+      <w:r>
+        <w:t xml:space="preserve"> y </w:t>
+      </w:r>
+      <w:r>
+        <w:rPr>
+          <w:rStyle w:val="CodeChar"/>
+        </w:rPr>
+        <w:t xml:space="preserve">datos/dataset_localidades.csv</w:t>
+      </w:r>
+      <w:r>
+        <w:t xml:space="preserve">.</w:t>
+      </w:r>
+    </w:p>
+    <w:p>
+      <w:pPr>
+        <w:pStyle w:val="Heading2"/>
+      </w:pPr>
+      <w:r>
+        <w:t xml:space="preserve">1. Problemática a analizar</w:t>
       </w:r>
     </w:p>
     <w:p>
       <w:pPr/>
       <w:r>
-        <w:rPr>
-          <w:b/>
-        </w:rPr>
-        <w:t xml:space="preserve">Por qué importa:</w:t>
-      </w:r>
-      <w:r>
-        <w:t xml:space="preserve"> si el clima explica una parte grande de la variación, un modelo de regresión puede anticipar los días críticos. Así se podrían activar medidas antes del episodio: suspender actividades al aire libre en escuelas, avisar a personas con asma o EPOC, restringir la circulación.</w:t>
+        <w:t xml:space="preserve">La contaminación de la ZMVM sube y baja mucho de un día a otro, aunque las emisiones cambian poco; esa variación la controla sobre todo el clima. Hoy las contingencias se activan cuando el episodio ya está ocurriendo.</w:t>
+      </w:r>
+    </w:p>
+    <w:p>
+      <w:pPr/>
+      <w:r>
+        <w:t xml:space="preserve">Los dos contaminantes que más afectan la salud y que más contingencias provocan son:</w:t>
       </w:r>
     </w:p>
     <w:p>
@@ -150,10 +135,10 @@
         <w:rPr>
           <w:b/>
         </w:rPr>
-        <w:t xml:space="preserve">Unidad de análisis:</w:t>
-      </w:r>
-      <w:r>
-        <w:t xml:space="preserve"> el día (3,653 días, del 1 de enero de 2015 al 31 de diciembre de 2024), con mediciones de 20 a 36 estaciones según el contaminante.</w:t>
+        <w:t xml:space="preserve">Ozono (O3):</w:t>
+      </w:r>
+      <w:r>
+        <w:t xml:space="preserve"> no se emite directamente. Se forma en el aire cuando los óxidos de nitrógeno y los compuestos orgánicos de vehículos e industria reaccionan con la radiación solar, así que depende de la temperatura y la insolación.</w:t>
       </w:r>
     </w:p>
     <w:p>
@@ -168,10 +153,142 @@
         <w:rPr>
           <w:b/>
         </w:rPr>
+        <w:t xml:space="preserve">Partículas finas (PM2.5):</w:t>
+      </w:r>
+      <w:r>
+        <w:t xml:space="preserve"> vienen de la combustión (vehículos, incendios, quemas, pirotecnia). Se acumulan cuando el aire está estancado: poco viento y una inversión térmica.</w:t>
+      </w:r>
+    </w:p>
+    <w:p>
+      <w:pPr/>
+      <w:r>
+        <w:t xml:space="preserve">En el EDA anterior estudiamos </w:t>
+      </w:r>
+      <w:r>
+        <w:rPr>
+          <w:b/>
+        </w:rPr>
+        <w:t xml:space="preserve">dónde</w:t>
+      </w:r>
+      <w:r>
+        <w:t xml:space="preserve"> está la contaminación y </w:t>
+      </w:r>
+      <w:r>
+        <w:rPr>
+          <w:b/>
+        </w:rPr>
+        <w:t xml:space="preserve">quién</w:t>
+      </w:r>
+      <w:r>
+        <w:t xml:space="preserve"> vive ahí (censo + satélite), pero solo con un promedio anual. No sabíamos </w:t>
+      </w:r>
+      <w:r>
+        <w:rPr>
+          <w:b/>
+        </w:rPr>
+        <w:t xml:space="preserve">cuándo</w:t>
+      </w:r>
+      <w:r>
+        <w:t xml:space="preserve"> ocurren los episodios ni qué los provoca, ni si el satélite es confiable. Ahora juntamos las dos dimensiones:</w:t>
+      </w:r>
+    </w:p>
+    <w:p>
+      <w:pPr/>
+      <w:r>
+        <w:rPr>
+          <w:b/>
+        </w:rPr>
+        <w:t xml:space="preserve">Pregunta 1 (tiempo):</w:t>
+      </w:r>
+      <w:r>
+        <w:t xml:space="preserve"> ¿Qué tanto de la variación diaria de PM2.5 y ozono se explica por la meteorología (temperatura, humedad, viento, estabilidad del aire) y el calendario? ¿Se puede anticipar un día que rebase la norma con información disponible el día anterior?</w:t>
+      </w:r>
+    </w:p>
+    <w:p>
+      <w:pPr/>
+      <w:r>
+        <w:rPr>
+          <w:b/>
+        </w:rPr>
+        <w:t xml:space="preserve">Pregunta 2 (espacio y población):</w:t>
+      </w:r>
+      <w:r>
+        <w:t xml:space="preserve"> ¿Qué población, y en particular qué población vulnerable, vive donde más días al año se rebasa la norma? ¿La exposición cambia con el nivel socioeconómico? ¿El satélite reproduce lo que miden las estaciones?</w:t>
+      </w:r>
+    </w:p>
+    <w:p>
+      <w:pPr/>
+      <w:r>
+        <w:rPr>
+          <w:b/>
+        </w:rPr>
+        <w:t xml:space="preserve">Por qué importa:</w:t>
+      </w:r>
+      <w:r>
+        <w:t xml:space="preserve"> si el clima explica una parte grande de la variación, un modelo de regresión puede anticipar los días críticos. Saber quién vive en las zonas con más días sobre la norma dice a quién dirigir los avisos: escuelas, adultos mayores, personas sin seguridad social.</w:t>
+      </w:r>
+    </w:p>
+    <w:p>
+      <w:pPr>
+        <w:pStyle w:val="ListParagraph"/>
+        <w:numPr>
+          <w:ilvl w:val="0"/>
+          <w:numId w:val="4"/>
+        </w:numPr>
+      </w:pPr>
+      <w:r>
+        <w:rPr>
+          <w:b/>
+        </w:rPr>
+        <w:t xml:space="preserve">Unidades de análisis:</w:t>
+      </w:r>
+      <w:r>
+        <w:t xml:space="preserve"> el </w:t>
+      </w:r>
+      <w:r>
+        <w:rPr>
+          <w:b/>
+        </w:rPr>
+        <w:t xml:space="preserve">día</w:t>
+      </w:r>
+      <w:r>
+        <w:t xml:space="preserve"> (3,653 días, 2015-2024) para la pregunta 1; la </w:t>
+      </w:r>
+      <w:r>
+        <w:rPr>
+          <w:b/>
+        </w:rPr>
+        <w:t xml:space="preserve">localidad</w:t>
+      </w:r>
+      <w:r>
+        <w:t xml:space="preserve"> (5,085 localidades de la CDMX y el Estado de México, 26.2 millones de personas) para la pregunta 2; y la </w:t>
+      </w:r>
+      <w:r>
+        <w:rPr>
+          <w:b/>
+        </w:rPr>
+        <w:t xml:space="preserve">estación</w:t>
+      </w:r>
+      <w:r>
+        <w:t xml:space="preserve"> (36 con datos 2015-2024) como puente entre las dos.</w:t>
+      </w:r>
+    </w:p>
+    <w:p>
+      <w:pPr>
+        <w:pStyle w:val="ListParagraph"/>
+        <w:numPr>
+          <w:ilvl w:val="0"/>
+          <w:numId w:val="4"/>
+        </w:numPr>
+      </w:pPr>
+      <w:r>
+        <w:rPr>
+          <w:b/>
+        </w:rPr>
         <w:t xml:space="preserve">Tipo de problema:</w:t>
       </w:r>
       <w:r>
-        <w:t xml:space="preserve"> los objetivos principales son continuos y se trabajan con los modelos de la unidad (regresión lineal, polinomial, robusta y redes neuronales). También hay objetivos binarios (¿se rebasó la norma?) para clasificación.</w:t>
+        <w:t xml:space="preserve"> los objetivos principales son continuos (concentraciones y días sobre la norma) y se trabajan con los modelos de la unidad (regresión lineal, polinomial, robusta y redes neuronales). También hay objetivos binarios (¿se rebasó la norma?) para clasificación.</w:t>
       </w:r>
     </w:p>
     <w:p>
@@ -742,35 +859,12 @@
       </w:tr>
     </w:tbl>
     <w:p>
-      <w:pPr>
-        <w:pStyle w:val="Heading2"/>
-      </w:pPr>
-      <w:r>
-        <w:t xml:space="preserve">3. Posibles variables objetivo</w:t>
-      </w:r>
-    </w:p>
-    <w:p>
       <w:pPr/>
       <w:r>
-        <w:t xml:space="preserve">Los dos objetivos principales son </w:t>
-      </w:r>
-      <w:r>
-        <w:rPr>
-          <w:rStyle w:val="CodeChar"/>
-        </w:rPr>
-        <w:t xml:space="preserve">pm25_prom</w:t>
-      </w:r>
-      <w:r>
-        <w:t xml:space="preserve"> y </w:t>
-      </w:r>
-      <w:r>
-        <w:rPr>
-          <w:rStyle w:val="CodeChar"/>
-        </w:rPr>
-        <w:t xml:space="preserve">o3_max1h</w:t>
-      </w:r>
-      <w:r>
-        <w:t xml:space="preserve">; los demás sirven como alternativas o para clasificación.</w:t>
+        <w:rPr>
+          <w:b/>
+        </w:rPr>
+        <w:t xml:space="preserve">Dataset por localidad (pregunta 2), con datos del EDA anterior:</w:t>
       </w:r>
     </w:p>
     <w:tbl>
@@ -797,6 +891,18 @@
           <w:p>
             <w:pPr/>
             <w:r>
+              <w:t xml:space="preserve">Grupo</w:t>
+            </w:r>
+          </w:p>
+        </w:tc>
+        <w:tc>
+          <w:tcPr>
+            <w:tcW w:w="3120" w:type="dxa"/>
+            <w:shd w:val="clear" w:color="auto" w:fill="F2F2F2"/>
+          </w:tcPr>
+          <w:p>
+            <w:pPr/>
+            <w:r>
               <w:t xml:space="preserve">Variable</w:t>
             </w:r>
           </w:p>
@@ -809,6 +915,389 @@
           <w:p>
             <w:pPr/>
             <w:r>
+              <w:t xml:space="preserve">Descripción</w:t>
+            </w:r>
+          </w:p>
+        </w:tc>
+      </w:tr>
+      <w:tr>
+        <w:tc>
+          <w:tcPr>
+            <w:tcW w:w="3120" w:type="dxa"/>
+          </w:tcPr>
+          <w:p>
+            <w:pPr/>
+            <w:r>
+              <w:t xml:space="preserve">Población</w:t>
+            </w:r>
+          </w:p>
+        </w:tc>
+        <w:tc>
+          <w:tcPr>
+            <w:tcW w:w="3120" w:type="dxa"/>
+          </w:tcPr>
+          <w:p>
+            <w:pPr/>
+            <w:r>
+              <w:rPr>
+                <w:rStyle w:val="CodeChar"/>
+              </w:rPr>
+              <w:t xml:space="preserve">POBTOT</w:t>
+            </w:r>
+            <w:r>
+              <w:t xml:space="preserve">, </w:t>
+            </w:r>
+            <w:r>
+              <w:rPr>
+                <w:rStyle w:val="CodeChar"/>
+              </w:rPr>
+              <w:t xml:space="preserve">POB0_14</w:t>
+            </w:r>
+            <w:r>
+              <w:t xml:space="preserve">, </w:t>
+            </w:r>
+            <w:r>
+              <w:rPr>
+                <w:rStyle w:val="CodeChar"/>
+              </w:rPr>
+              <w:t xml:space="preserve">POB65_MAS</w:t>
+            </w:r>
+            <w:r>
+              <w:t xml:space="preserve">, </w:t>
+            </w:r>
+            <w:r>
+              <w:rPr>
+                <w:rStyle w:val="CodeChar"/>
+              </w:rPr>
+              <w:t xml:space="preserve">PCON_DISC</w:t>
+            </w:r>
+          </w:p>
+        </w:tc>
+        <w:tc>
+          <w:tcPr>
+            <w:tcW w:w="3120" w:type="dxa"/>
+          </w:tcPr>
+          <w:p>
+            <w:pPr/>
+            <w:r>
+              <w:t xml:space="preserve">Población total y grupos vulnerables (Censo 2020)</w:t>
+            </w:r>
+          </w:p>
+        </w:tc>
+      </w:tr>
+      <w:tr>
+        <w:tc>
+          <w:tcPr>
+            <w:tcW w:w="3120" w:type="dxa"/>
+          </w:tcPr>
+          <w:p>
+            <w:pPr/>
+            <w:r>
+              <w:t xml:space="preserve">Acceso a salud</w:t>
+            </w:r>
+          </w:p>
+        </w:tc>
+        <w:tc>
+          <w:tcPr>
+            <w:tcW w:w="3120" w:type="dxa"/>
+          </w:tcPr>
+          <w:p>
+            <w:pPr/>
+            <w:r>
+              <w:rPr>
+                <w:rStyle w:val="CodeChar"/>
+              </w:rPr>
+              <w:t xml:space="preserve">PSINDER</w:t>
+            </w:r>
+            <w:r>
+              <w:t xml:space="preserve">, </w:t>
+            </w:r>
+            <w:r>
+              <w:rPr>
+                <w:rStyle w:val="CodeChar"/>
+              </w:rPr>
+              <w:t xml:space="preserve">pct_sin_derechohab</w:t>
+            </w:r>
+          </w:p>
+        </w:tc>
+        <w:tc>
+          <w:tcPr>
+            <w:tcW w:w="3120" w:type="dxa"/>
+          </w:tcPr>
+          <w:p>
+            <w:pPr/>
+            <w:r>
+              <w:t xml:space="preserve">Personas sin derechohabiencia</w:t>
+            </w:r>
+          </w:p>
+        </w:tc>
+      </w:tr>
+      <w:tr>
+        <w:tc>
+          <w:tcPr>
+            <w:tcW w:w="3120" w:type="dxa"/>
+          </w:tcPr>
+          <w:p>
+            <w:pPr/>
+            <w:r>
+              <w:t xml:space="preserve">Nivel socioeconómico</w:t>
+            </w:r>
+          </w:p>
+        </w:tc>
+        <w:tc>
+          <w:tcPr>
+            <w:tcW w:w="3120" w:type="dxa"/>
+          </w:tcPr>
+          <w:p>
+            <w:pPr/>
+            <w:r>
+              <w:rPr>
+                <w:rStyle w:val="CodeChar"/>
+              </w:rPr>
+              <w:t xml:space="preserve">GRAPROES</w:t>
+            </w:r>
+            <w:r>
+              <w:t xml:space="preserve">, </w:t>
+            </w:r>
+            <w:r>
+              <w:rPr>
+                <w:rStyle w:val="CodeChar"/>
+              </w:rPr>
+              <w:t xml:space="preserve">pct_viv_auto</w:t>
+            </w:r>
+          </w:p>
+        </w:tc>
+        <w:tc>
+          <w:tcPr>
+            <w:tcW w:w="3120" w:type="dxa"/>
+          </w:tcPr>
+          <w:p>
+            <w:pPr/>
+            <w:r>
+              <w:t xml:space="preserve">Escolaridad promedio y % de viviendas con automóvil</w:t>
+            </w:r>
+          </w:p>
+        </w:tc>
+      </w:tr>
+      <w:tr>
+        <w:tc>
+          <w:tcPr>
+            <w:tcW w:w="3120" w:type="dxa"/>
+          </w:tcPr>
+          <w:p>
+            <w:pPr/>
+            <w:r>
+              <w:t xml:space="preserve">Ubicación</w:t>
+            </w:r>
+          </w:p>
+        </w:tc>
+        <w:tc>
+          <w:tcPr>
+            <w:tcW w:w="3120" w:type="dxa"/>
+          </w:tcPr>
+          <w:p>
+            <w:pPr/>
+            <w:r>
+              <w:rPr>
+                <w:rStyle w:val="CodeChar"/>
+              </w:rPr>
+              <w:t xml:space="preserve">lon</w:t>
+            </w:r>
+            <w:r>
+              <w:t xml:space="preserve">, </w:t>
+            </w:r>
+            <w:r>
+              <w:rPr>
+                <w:rStyle w:val="CodeChar"/>
+              </w:rPr>
+              <w:t xml:space="preserve">lat</w:t>
+            </w:r>
+            <w:r>
+              <w:t xml:space="preserve">, </w:t>
+            </w:r>
+            <w:r>
+              <w:rPr>
+                <w:rStyle w:val="CodeChar"/>
+              </w:rPr>
+              <w:t xml:space="preserve">ALTITUD</w:t>
+            </w:r>
+          </w:p>
+        </w:tc>
+        <w:tc>
+          <w:tcPr>
+            <w:tcW w:w="3120" w:type="dxa"/>
+          </w:tcPr>
+          <w:p>
+            <w:pPr/>
+            <w:r>
+              <w:t xml:space="preserve">Coordenadas y altitud de la localidad</w:t>
+            </w:r>
+          </w:p>
+        </w:tc>
+      </w:tr>
+      <w:tr>
+        <w:tc>
+          <w:tcPr>
+            <w:tcW w:w="3120" w:type="dxa"/>
+          </w:tcPr>
+          <w:p>
+            <w:pPr/>
+            <w:r>
+              <w:t xml:space="preserve">Contaminación satelital</w:t>
+            </w:r>
+          </w:p>
+        </w:tc>
+        <w:tc>
+          <w:tcPr>
+            <w:tcW w:w="3120" w:type="dxa"/>
+          </w:tcPr>
+          <w:p>
+            <w:pPr/>
+            <w:r>
+              <w:rPr>
+                <w:rStyle w:val="CodeChar"/>
+              </w:rPr>
+              <w:t xml:space="preserve">pm25_sat</w:t>
+            </w:r>
+            <w:r>
+              <w:t xml:space="preserve">, </w:t>
+            </w:r>
+            <w:r>
+              <w:rPr>
+                <w:rStyle w:val="CodeChar"/>
+              </w:rPr>
+              <w:t xml:space="preserve">no2_sat</w:t>
+            </w:r>
+          </w:p>
+        </w:tc>
+        <w:tc>
+          <w:tcPr>
+            <w:tcW w:w="3120" w:type="dxa"/>
+          </w:tcPr>
+          <w:p>
+            <w:pPr/>
+            <w:r>
+              <w:t xml:space="preserve">Promedio anual 2020 (ACAG, ≈1.1 km)</w:t>
+            </w:r>
+          </w:p>
+        </w:tc>
+      </w:tr>
+      <w:tr>
+        <w:tc>
+          <w:tcPr>
+            <w:tcW w:w="3120" w:type="dxa"/>
+          </w:tcPr>
+          <w:p>
+            <w:pPr/>
+            <w:r>
+              <w:t xml:space="preserve">Distancia a la red (nuevo)</w:t>
+            </w:r>
+          </w:p>
+        </w:tc>
+        <w:tc>
+          <w:tcPr>
+            <w:tcW w:w="3120" w:type="dxa"/>
+          </w:tcPr>
+          <w:p>
+            <w:pPr/>
+            <w:r>
+              <w:rPr>
+                <w:rStyle w:val="CodeChar"/>
+              </w:rPr>
+              <w:t xml:space="preserve">dist_est_o3_km</w:t>
+            </w:r>
+            <w:r>
+              <w:t xml:space="preserve">, </w:t>
+            </w:r>
+            <w:r>
+              <w:rPr>
+                <w:rStyle w:val="CodeChar"/>
+              </w:rPr>
+              <w:t xml:space="preserve">dist_est_pm25_km</w:t>
+            </w:r>
+          </w:p>
+        </w:tc>
+        <w:tc>
+          <w:tcPr>
+            <w:tcW w:w="3120" w:type="dxa"/>
+          </w:tcPr>
+          <w:p>
+            <w:pPr/>
+            <w:r>
+              <w:t xml:space="preserve">Distancia a la estación RAMA más cercana</w:t>
+            </w:r>
+          </w:p>
+        </w:tc>
+      </w:tr>
+    </w:tbl>
+    <w:p>
+      <w:pPr>
+        <w:pStyle w:val="Heading2"/>
+      </w:pPr>
+      <w:r>
+        <w:t xml:space="preserve">3. Posibles variables objetivo</w:t>
+      </w:r>
+    </w:p>
+    <w:p>
+      <w:pPr/>
+      <w:r>
+        <w:t xml:space="preserve">Los dos objetivos principales son </w:t>
+      </w:r>
+      <w:r>
+        <w:rPr>
+          <w:rStyle w:val="CodeChar"/>
+        </w:rPr>
+        <w:t xml:space="preserve">pm25_prom</w:t>
+      </w:r>
+      <w:r>
+        <w:t xml:space="preserve"> y </w:t>
+      </w:r>
+      <w:r>
+        <w:rPr>
+          <w:rStyle w:val="CodeChar"/>
+        </w:rPr>
+        <w:t xml:space="preserve">o3_max1h</w:t>
+      </w:r>
+      <w:r>
+        <w:t xml:space="preserve">; los demás sirven como alternativas o para clasificación.</w:t>
+      </w:r>
+    </w:p>
+    <w:tbl>
+      <w:tblPr>
+        <w:tblStyle w:val="TableGrid"/>
+        <w:tblW w:w="0" w:type="auto"/>
+        <w:tblLayout w:type="fixed"/>
+        <w:tblLook w:val="04A0" w:firstRow="1" w:lastRow="0" w:firstColumn="0" w:lastColumn="0" w:noHBand="0" w:noVBand="1"/>
+      </w:tblPr>
+      <w:tblGrid>
+        <w:gridCol w:w="3120"/>
+        <w:gridCol w:w="3120"/>
+        <w:gridCol w:w="3120"/>
+      </w:tblGrid>
+      <w:tr>
+        <w:trPr>
+          <w:tblHeader/>
+        </w:trPr>
+        <w:tc>
+          <w:tcPr>
+            <w:tcW w:w="3120" w:type="dxa"/>
+            <w:shd w:val="clear" w:color="auto" w:fill="F2F2F2"/>
+          </w:tcPr>
+          <w:p>
+            <w:pPr/>
+            <w:r>
+              <w:t xml:space="preserve">Variable</w:t>
+            </w:r>
+          </w:p>
+        </w:tc>
+        <w:tc>
+          <w:tcPr>
+            <w:tcW w:w="3120" w:type="dxa"/>
+            <w:shd w:val="clear" w:color="auto" w:fill="F2F2F2"/>
+          </w:tcPr>
+          <w:p>
+            <w:pPr/>
+            <w:r>
               <w:t xml:space="preserve">Qué mide</w:t>
             </w:r>
           </w:p>
@@ -1108,6 +1597,193 @@
             <w:pPr/>
             <w:r>
               <w:t xml:space="preserve">Secundarios</w:t>
+            </w:r>
+          </w:p>
+        </w:tc>
+      </w:tr>
+    </w:tbl>
+    <w:p>
+      <w:pPr/>
+      <w:r>
+        <w:rPr>
+          <w:b/>
+        </w:rPr>
+        <w:t xml:space="preserve">Objetivos del dataset por localidad:</w:t>
+      </w:r>
+    </w:p>
+    <w:tbl>
+      <w:tblPr>
+        <w:tblStyle w:val="TableGrid"/>
+        <w:tblW w:w="0" w:type="auto"/>
+        <w:tblLayout w:type="fixed"/>
+        <w:tblLook w:val="04A0" w:firstRow="1" w:lastRow="0" w:firstColumn="0" w:lastColumn="0" w:noHBand="0" w:noVBand="1"/>
+      </w:tblPr>
+      <w:tblGrid>
+        <w:gridCol w:w="3120"/>
+        <w:gridCol w:w="3120"/>
+        <w:gridCol w:w="3120"/>
+      </w:tblGrid>
+      <w:tr>
+        <w:trPr>
+          <w:tblHeader/>
+        </w:trPr>
+        <w:tc>
+          <w:tcPr>
+            <w:tcW w:w="3120" w:type="dxa"/>
+            <w:shd w:val="clear" w:color="auto" w:fill="F2F2F2"/>
+          </w:tcPr>
+          <w:p>
+            <w:pPr/>
+            <w:r>
+              <w:t xml:space="preserve">Variable</w:t>
+            </w:r>
+          </w:p>
+        </w:tc>
+        <w:tc>
+          <w:tcPr>
+            <w:tcW w:w="3120" w:type="dxa"/>
+            <w:shd w:val="clear" w:color="auto" w:fill="F2F2F2"/>
+          </w:tcPr>
+          <w:p>
+            <w:pPr/>
+            <w:r>
+              <w:t xml:space="preserve">Qué mide</w:t>
+            </w:r>
+          </w:p>
+        </w:tc>
+        <w:tc>
+          <w:tcPr>
+            <w:tcW w:w="3120" w:type="dxa"/>
+            <w:shd w:val="clear" w:color="auto" w:fill="F2F2F2"/>
+          </w:tcPr>
+          <w:p>
+            <w:pPr/>
+            <w:r>
+              <w:t xml:space="preserve">Uso</w:t>
+            </w:r>
+          </w:p>
+        </w:tc>
+      </w:tr>
+      <w:tr>
+        <w:tc>
+          <w:tcPr>
+            <w:tcW w:w="3120" w:type="dxa"/>
+          </w:tcPr>
+          <w:p>
+            <w:pPr/>
+            <w:r>
+              <w:rPr>
+                <w:rStyle w:val="CodeChar"/>
+                <w:b/>
+              </w:rPr>
+              <w:t xml:space="preserve">o3_dias_sobre_nom</w:t>
+            </w:r>
+          </w:p>
+        </w:tc>
+        <w:tc>
+          <w:tcPr>
+            <w:tcW w:w="3120" w:type="dxa"/>
+          </w:tcPr>
+          <w:p>
+            <w:pPr/>
+            <w:r>
+              <w:t xml:space="preserve">Días al año con ozono &gt; 90 ppb en la estación más cercana (≤ 5 km)</w:t>
+            </w:r>
+          </w:p>
+        </w:tc>
+        <w:tc>
+          <w:tcPr>
+            <w:tcW w:w="3120" w:type="dxa"/>
+          </w:tcPr>
+          <w:p>
+            <w:pPr/>
+            <w:r>
+              <w:t xml:space="preserve">Objetivo espacial principal</w:t>
+            </w:r>
+          </w:p>
+        </w:tc>
+      </w:tr>
+      <w:tr>
+        <w:tc>
+          <w:tcPr>
+            <w:tcW w:w="3120" w:type="dxa"/>
+          </w:tcPr>
+          <w:p>
+            <w:pPr/>
+            <w:r>
+              <w:rPr>
+                <w:rStyle w:val="CodeChar"/>
+              </w:rPr>
+              <w:t xml:space="preserve">pm25_dias_sobre_nom</w:t>
+            </w:r>
+          </w:p>
+        </w:tc>
+        <w:tc>
+          <w:tcPr>
+            <w:tcW w:w="3120" w:type="dxa"/>
+          </w:tcPr>
+          <w:p>
+            <w:pPr/>
+            <w:r>
+              <w:t xml:space="preserve">Días al año con PM2.5 &gt; 41 µg/m³ en la estación más cercana (≤ 5 km)</w:t>
+            </w:r>
+          </w:p>
+        </w:tc>
+        <w:tc>
+          <w:tcPr>
+            <w:tcW w:w="3120" w:type="dxa"/>
+          </w:tcPr>
+          <w:p>
+            <w:pPr/>
+            <w:r>
+              <w:t xml:space="preserve">Objetivo espacial</w:t>
+            </w:r>
+          </w:p>
+        </w:tc>
+      </w:tr>
+      <w:tr>
+        <w:tc>
+          <w:tcPr>
+            <w:tcW w:w="3120" w:type="dxa"/>
+          </w:tcPr>
+          <w:p>
+            <w:pPr/>
+            <w:r>
+              <w:rPr>
+                <w:rStyle w:val="CodeChar"/>
+              </w:rPr>
+              <w:t xml:space="preserve">pm25_sat</w:t>
+            </w:r>
+            <w:r>
+              <w:t xml:space="preserve">, </w:t>
+            </w:r>
+            <w:r>
+              <w:rPr>
+                <w:rStyle w:val="CodeChar"/>
+              </w:rPr>
+              <w:t xml:space="preserve">no2_sat</w:t>
+            </w:r>
+          </w:p>
+        </w:tc>
+        <w:tc>
+          <w:tcPr>
+            <w:tcW w:w="3120" w:type="dxa"/>
+          </w:tcPr>
+          <w:p>
+            <w:pPr/>
+            <w:r>
+              <w:t xml:space="preserve">Contaminación satelital anual 2020</w:t>
+            </w:r>
+          </w:p>
+        </w:tc>
+        <w:tc>
+          <w:tcPr>
+            <w:tcW w:w="3120" w:type="dxa"/>
+          </w:tcPr>
+          <w:p>
+            <w:pPr/>
+            <w:r>
+              <w:t xml:space="preserve">Objetivo espacial con cobertura total</w:t>
             </w:r>
           </w:p>
         </w:tc>
@@ -1141,7 +1817,7 @@
     <w:p>
       <w:pPr/>
       <w:r>
-        <w:t xml:space="preserve">Revisamos 10 fuentes y nos quedamos con las dos redes horarias del SIMAT, porque son las únicas con variación día a día.</w:t>
+        <w:t xml:space="preserve">Revisamos 10 fuentes. Usamos las tres del SIMAT (nuevas) junto con cuatro del EDA anterior, y descartamos los egresos hospitalarios.</w:t>
       </w:r>
     </w:p>
     <w:tbl>
@@ -1249,6 +1925,9 @@
                 <w:t xml:space="preserve">RAMA, bases horarias de contaminantes</w:t>
               </w:r>
             </w:hyperlink>
+            <w:r>
+              <w:t xml:space="preserve"> (nuevo)</w:t>
+            </w:r>
           </w:p>
         </w:tc>
         <w:tc>
@@ -1286,7 +1965,7 @@
               <w:t xml:space="preserve">Sí.</w:t>
             </w:r>
             <w:r>
-              <w:t xml:space="preserve"> Variables objetivo</w:t>
+              <w:t xml:space="preserve"> Objetivos diarios y días sobre la norma por estación</w:t>
             </w:r>
           </w:p>
         </w:tc>
@@ -1317,6 +1996,9 @@
                 <w:t xml:space="preserve">REDMET, bases horarias de meteorología</w:t>
               </w:r>
             </w:hyperlink>
+            <w:r>
+              <w:t xml:space="preserve"> (nuevo)</w:t>
+            </w:r>
           </w:p>
         </w:tc>
         <w:tc>
@@ -1354,7 +2036,7 @@
               <w:t xml:space="preserve">Sí.</w:t>
             </w:r>
             <w:r>
-              <w:t xml:space="preserve"> Variables de entrada</w:t>
+              <w:t xml:space="preserve"> Entradas del dataset diario</w:t>
             </w:r>
           </w:p>
         </w:tc>
@@ -1378,7 +2060,7 @@
           <w:p>
             <w:pPr/>
             <w:r>
-              <w:t xml:space="preserve">Catálogo de estaciones del SIMAT</w:t>
+              <w:t xml:space="preserve">Catálogo de estaciones del SIMAT (nuevo)</w:t>
             </w:r>
           </w:p>
         </w:tc>
@@ -1400,18 +2082,24 @@
           <w:p>
             <w:pPr/>
             <w:r>
-              <w:t xml:space="preserve">Clave, nombre, coordenadas y altitud</w:t>
-            </w:r>
-          </w:p>
-        </w:tc>
-        <w:tc>
-          <w:tcPr>
-            <w:tcW w:w="1872" w:type="dxa"/>
-          </w:tcPr>
-          <w:p>
-            <w:pPr/>
-            <w:r>
-              <w:t xml:space="preserve">Sí, como referencia</w:t>
+              <w:t xml:space="preserve">Coordenadas y altitud de cada estación</w:t>
+            </w:r>
+          </w:p>
+        </w:tc>
+        <w:tc>
+          <w:tcPr>
+            <w:tcW w:w="1872" w:type="dxa"/>
+          </w:tcPr>
+          <w:p>
+            <w:pPr/>
+            <w:r>
+              <w:rPr>
+                <w:b/>
+              </w:rPr>
+              <w:t xml:space="preserve">Sí.</w:t>
+            </w:r>
+            <w:r>
+              <w:t xml:space="preserve"> Une estaciones con localidades</w:t>
             </w:r>
           </w:p>
         </w:tc>
@@ -1425,72 +2113,6 @@
             <w:pPr/>
             <w:r>
               <w:t xml:space="preserve">4</w:t>
-            </w:r>
-          </w:p>
-        </w:tc>
-        <w:tc>
-          <w:tcPr>
-            <w:tcW w:w="1872" w:type="dxa"/>
-          </w:tcPr>
-          <w:p>
-            <w:pPr/>
-            <w:r>
-              <w:t xml:space="preserve">Promedios de la RAMA por localidad (</w:t>
-            </w:r>
-            <w:r>
-              <w:rPr>
-                <w:rStyle w:val="CodeChar"/>
-              </w:rPr>
-              <w:t xml:space="preserve">cont_loc_mean.csv</w:t>
-            </w:r>
-            <w:r>
-              <w:t xml:space="preserve">)</w:t>
-            </w:r>
-          </w:p>
-        </w:tc>
-        <w:tc>
-          <w:tcPr>
-            <w:tcW w:w="1872" w:type="dxa"/>
-          </w:tcPr>
-          <w:p>
-            <w:pPr/>
-            <w:r>
-              <w:t xml:space="preserve">SEDEMA CDMX</w:t>
-            </w:r>
-          </w:p>
-        </w:tc>
-        <w:tc>
-          <w:tcPr>
-            <w:tcW w:w="1872" w:type="dxa"/>
-          </w:tcPr>
-          <w:p>
-            <w:pPr/>
-            <w:r>
-              <w:t xml:space="preserve">Promedio por contaminante para 494 localidades</w:t>
-            </w:r>
-          </w:p>
-        </w:tc>
-        <w:tc>
-          <w:tcPr>
-            <w:tcW w:w="1872" w:type="dxa"/>
-          </w:tcPr>
-          <w:p>
-            <w:pPr/>
-            <w:r>
-              <w:t xml:space="preserve">Revisada en el EDA anterior. Es un corte transversal sin dimensión de tiempo</w:t>
-            </w:r>
-          </w:p>
-        </w:tc>
-      </w:tr>
-      <w:tr>
-        <w:tc>
-          <w:tcPr>
-            <w:tcW w:w="1872" w:type="dxa"/>
-          </w:tcPr>
-          <w:p>
-            <w:pPr/>
-            <w:r>
-              <w:t xml:space="preserve">5</w:t>
             </w:r>
           </w:p>
         </w:tc>
@@ -1505,9 +2127,94 @@
                 <w:rPr>
                   <w:rStyle w:val="Hyperlink"/>
                 </w:rPr>
-                <w:t xml:space="preserve">Satélite ACAG: PM2.5 y NO2</w:t>
+                <w:t xml:space="preserve">Censo de Población y Vivienda 2020, ITER</w:t>
               </w:r>
             </w:hyperlink>
+            <w:r>
+              <w:t xml:space="preserve"> (EDA anterior)</w:t>
+            </w:r>
+          </w:p>
+        </w:tc>
+        <w:tc>
+          <w:tcPr>
+            <w:tcW w:w="1872" w:type="dxa"/>
+          </w:tcPr>
+          <w:p>
+            <w:pPr/>
+            <w:r>
+              <w:t xml:space="preserve">INEGI</w:t>
+            </w:r>
+          </w:p>
+        </w:tc>
+        <w:tc>
+          <w:tcPr>
+            <w:tcW w:w="1872" w:type="dxa"/>
+          </w:tcPr>
+          <w:p>
+            <w:pPr/>
+            <w:r>
+              <w:t xml:space="preserve">232 variables para 5,085 localidades</w:t>
+            </w:r>
+          </w:p>
+        </w:tc>
+        <w:tc>
+          <w:tcPr>
+            <w:tcW w:w="1872" w:type="dxa"/>
+          </w:tcPr>
+          <w:p>
+            <w:pPr/>
+            <w:r>
+              <w:rPr>
+                <w:b/>
+              </w:rPr>
+              <w:t xml:space="preserve">Sí.</w:t>
+            </w:r>
+            <w:r>
+              <w:t xml:space="preserve"> Población y vulnerabilidad</w:t>
+            </w:r>
+          </w:p>
+        </w:tc>
+      </w:tr>
+      <w:tr>
+        <w:tc>
+          <w:tcPr>
+            <w:tcW w:w="1872" w:type="dxa"/>
+          </w:tcPr>
+          <w:p>
+            <w:pPr/>
+            <w:r>
+              <w:t xml:space="preserve">5</w:t>
+            </w:r>
+          </w:p>
+        </w:tc>
+        <w:tc>
+          <w:tcPr>
+            <w:tcW w:w="1872" w:type="dxa"/>
+          </w:tcPr>
+          <w:p>
+            <w:pPr/>
+            <w:hyperlink r:id="rId7" w:history="1">
+              <w:r>
+                <w:rPr>
+                  <w:rStyle w:val="Hyperlink"/>
+                </w:rPr>
+                <w:t xml:space="preserve">Satélite ACAG: PM2.5</w:t>
+              </w:r>
+            </w:hyperlink>
+            <w:r>
+              <w:t xml:space="preserve"> y </w:t>
+            </w:r>
+            <w:hyperlink r:id="rId8" w:history="1">
+              <w:r>
+                <w:rPr>
+                  <w:rStyle w:val="Hyperlink"/>
+                </w:rPr>
+                <w:t xml:space="preserve">NO2</w:t>
+              </w:r>
+            </w:hyperlink>
+            <w:r>
+              <w:t xml:space="preserve"> (EDA anterior)</w:t>
+            </w:r>
           </w:p>
         </w:tc>
         <w:tc>
@@ -1528,18 +2235,24 @@
           <w:p>
             <w:pPr/>
             <w:r>
-              <w:t xml:space="preserve">Rásteres anuales de ≈1.1 km</w:t>
-            </w:r>
-          </w:p>
-        </w:tc>
-        <w:tc>
-          <w:tcPr>
-            <w:tcW w:w="1872" w:type="dxa"/>
-          </w:tcPr>
-          <w:p>
-            <w:pPr/>
-            <w:r>
-              <w:t xml:space="preserve">Revisada en el EDA anterior. Un valor por año, no sirve para el análisis diario</w:t>
+              <w:t xml:space="preserve">Rásteres de ≈1.1 km, 2020</w:t>
+            </w:r>
+          </w:p>
+        </w:tc>
+        <w:tc>
+          <w:tcPr>
+            <w:tcW w:w="1872" w:type="dxa"/>
+          </w:tcPr>
+          <w:p>
+            <w:pPr/>
+            <w:r>
+              <w:rPr>
+                <w:b/>
+              </w:rPr>
+              <w:t xml:space="preserve">Sí.</w:t>
+            </w:r>
+            <w:r>
+              <w:t xml:space="preserve"> Cobertura total; se valida con la RAMA</w:t>
             </w:r>
           </w:p>
         </w:tc>
@@ -1563,7 +2276,79 @@
           <w:p>
             <w:pPr/>
             <w:r>
-              <w:t xml:space="preserve">Censo de Población y Vivienda 2020</w:t>
+              <w:t xml:space="preserve">Promedios de la RAMA por localidad, </w:t>
+            </w:r>
+            <w:r>
+              <w:rPr>
+                <w:rStyle w:val="CodeChar"/>
+              </w:rPr>
+              <w:t xml:space="preserve">cont_loc_mean.csv</w:t>
+            </w:r>
+            <w:r>
+              <w:t xml:space="preserve"> (EDA anterior)</w:t>
+            </w:r>
+          </w:p>
+        </w:tc>
+        <w:tc>
+          <w:tcPr>
+            <w:tcW w:w="1872" w:type="dxa"/>
+          </w:tcPr>
+          <w:p>
+            <w:pPr/>
+            <w:r>
+              <w:t xml:space="preserve">SEDEMA CDMX</w:t>
+            </w:r>
+          </w:p>
+        </w:tc>
+        <w:tc>
+          <w:tcPr>
+            <w:tcW w:w="1872" w:type="dxa"/>
+          </w:tcPr>
+          <w:p>
+            <w:pPr/>
+            <w:r>
+              <w:t xml:space="preserve">Promedio por contaminante para 494 localidades de la CDMX</w:t>
+            </w:r>
+          </w:p>
+        </w:tc>
+        <w:tc>
+          <w:tcPr>
+            <w:tcW w:w="1872" w:type="dxa"/>
+          </w:tcPr>
+          <w:p>
+            <w:pPr/>
+            <w:r>
+              <w:rPr>
+                <w:b/>
+              </w:rPr>
+              <w:t xml:space="preserve">Sí</w:t>
+            </w:r>
+            <w:r>
+              <w:t xml:space="preserve">, como referencia</w:t>
+            </w:r>
+          </w:p>
+        </w:tc>
+      </w:tr>
+      <w:tr>
+        <w:tc>
+          <w:tcPr>
+            <w:tcW w:w="1872" w:type="dxa"/>
+          </w:tcPr>
+          <w:p>
+            <w:pPr/>
+            <w:r>
+              <w:t xml:space="preserve">7</w:t>
+            </w:r>
+          </w:p>
+        </w:tc>
+        <w:tc>
+          <w:tcPr>
+            <w:tcW w:w="1872" w:type="dxa"/>
+          </w:tcPr>
+          <w:p>
+            <w:pPr/>
+            <w:r>
+              <w:t xml:space="preserve">Marco Geoestadístico 2020 (EDA anterior)</w:t>
             </w:r>
           </w:p>
         </w:tc>
@@ -1585,31 +2370,31 @@
           <w:p>
             <w:pPr/>
             <w:r>
-              <w:t xml:space="preserve">Población y vivienda por localidad y AGEB</w:t>
-            </w:r>
-          </w:p>
-        </w:tc>
-        <w:tc>
-          <w:tcPr>
-            <w:tcW w:w="1872" w:type="dxa"/>
-          </w:tcPr>
-          <w:p>
-            <w:pPr/>
-            <w:r>
-              <w:t xml:space="preserve">Revisada. Es estático</w:t>
-            </w:r>
-          </w:p>
-        </w:tc>
-      </w:tr>
-      <w:tr>
-        <w:tc>
-          <w:tcPr>
-            <w:tcW w:w="1872" w:type="dxa"/>
-          </w:tcPr>
-          <w:p>
-            <w:pPr/>
-            <w:r>
-              <w:t xml:space="preserve">7</w:t>
+              <w:t xml:space="preserve">Polígonos de municipios</w:t>
+            </w:r>
+          </w:p>
+        </w:tc>
+        <w:tc>
+          <w:tcPr>
+            <w:tcW w:w="1872" w:type="dxa"/>
+          </w:tcPr>
+          <w:p>
+            <w:pPr/>
+            <w:r>
+              <w:t xml:space="preserve">Sí, para los mapas</w:t>
+            </w:r>
+          </w:p>
+        </w:tc>
+      </w:tr>
+      <w:tr>
+        <w:tc>
+          <w:tcPr>
+            <w:tcW w:w="1872" w:type="dxa"/>
+          </w:tcPr>
+          <w:p>
+            <w:pPr/>
+            <w:r>
+              <w:t xml:space="preserve">8</w:t>
             </w:r>
           </w:p>
         </w:tc>
@@ -1659,64 +2444,7 @@
               <w:t xml:space="preserve">Revisada y descartada.</w:t>
             </w:r>
             <w:r>
-              <w:t xml:space="preserve"> Las hospitalizaciones respiratorias seguían el mismo patrón que las de lesiones (ρ = 0.80): medían acceso al hospital, no el efecto del aire</w:t>
-            </w:r>
-          </w:p>
-        </w:tc>
-      </w:tr>
-      <w:tr>
-        <w:tc>
-          <w:tcPr>
-            <w:tcW w:w="1872" w:type="dxa"/>
-          </w:tcPr>
-          <w:p>
-            <w:pPr/>
-            <w:r>
-              <w:t xml:space="preserve">8</w:t>
-            </w:r>
-          </w:p>
-        </w:tc>
-        <w:tc>
-          <w:tcPr>
-            <w:tcW w:w="1872" w:type="dxa"/>
-          </w:tcPr>
-          <w:p>
-            <w:pPr/>
-            <w:r>
-              <w:t xml:space="preserve">Índice AIRE Y SALUD y contingencias</w:t>
-            </w:r>
-          </w:p>
-        </w:tc>
-        <w:tc>
-          <w:tcPr>
-            <w:tcW w:w="1872" w:type="dxa"/>
-          </w:tcPr>
-          <w:p>
-            <w:pPr/>
-            <w:r>
-              <w:t xml:space="preserve">SEDEMA CDMX</w:t>
-            </w:r>
-          </w:p>
-        </w:tc>
-        <w:tc>
-          <w:tcPr>
-            <w:tcW w:w="1872" w:type="dxa"/>
-          </w:tcPr>
-          <w:p>
-            <w:pPr/>
-            <w:r>
-              <w:t xml:space="preserve">Índice horario y fechas de contingencias</w:t>
-            </w:r>
-          </w:p>
-        </w:tc>
-        <w:tc>
-          <w:tcPr>
-            <w:tcW w:w="1872" w:type="dxa"/>
-          </w:tcPr>
-          <w:p>
-            <w:pPr/>
-            <w:r>
-              <w:t xml:space="preserve">Revisada. Se deriva de los mismos datos de la RAMA</w:t>
+              <w:t xml:space="preserve"> Las hospitalizaciones respiratorias seguían el patrón de las de lesiones (ρ = 0.80): medían acceso al hospital, no el efecto del aire</w:t>
             </w:r>
           </w:p>
         </w:tc>
@@ -1739,7 +2467,7 @@
           </w:tcPr>
           <w:p>
             <w:pPr/>
-            <w:hyperlink r:id="rId7" w:history="1">
+            <w:hyperlink r:id="rId9" w:history="1">
               <w:r>
                 <w:rPr>
                   <w:rStyle w:val="Hyperlink"/>
@@ -1778,7 +2506,7 @@
           <w:p>
             <w:pPr/>
             <w:r>
-              <w:t xml:space="preserve">Revisada. Es anual</w:t>
+              <w:t xml:space="preserve">Revisada. Es anual y por entidad</w:t>
             </w:r>
           </w:p>
         </w:tc>
@@ -1801,7 +2529,7 @@
           </w:tcPr>
           <w:p>
             <w:pPr/>
-            <w:hyperlink r:id="rId8" w:history="1">
+            <w:hyperlink r:id="rId10" w:history="1">
               <w:r>
                 <w:rPr>
                   <w:rStyle w:val="Hyperlink"/>
@@ -1812,7 +2540,7 @@
             <w:r>
               <w:t xml:space="preserve"> / </w:t>
             </w:r>
-            <w:hyperlink r:id="rId9" w:history="1">
+            <w:hyperlink r:id="rId11" w:history="1">
               <w:r>
                 <w:rPr>
                   <w:rStyle w:val="Hyperlink"/>
@@ -1882,85 +2610,11 @@
         <w:pStyle w:val="ListParagraph"/>
         <w:numPr>
           <w:ilvl w:val="0"/>
-          <w:numId w:val="4"/>
+          <w:numId w:val="5"/>
         </w:numPr>
       </w:pPr>
       <w:r>
         <w:t xml:space="preserve">Las dos redes son de la misma institución y comparten claves de estación y hora, así que se unen sin ambigüedad.</w:t>
-      </w:r>
-    </w:p>
-    <w:p>
-      <w:pPr>
-        <w:pStyle w:val="ListParagraph"/>
-        <w:numPr>
-          <w:ilvl w:val="0"/>
-          <w:numId w:val="4"/>
-        </w:numPr>
-      </w:pPr>
-      <w:r>
-        <w:t xml:space="preserve">Tienen la resolución que pide la pregunta: día a día, no promedios anuales ni censales.</w:t>
-      </w:r>
-    </w:p>
-    <w:p>
-      <w:pPr>
-        <w:pStyle w:val="ListParagraph"/>
-        <w:numPr>
-          <w:ilvl w:val="0"/>
-          <w:numId w:val="4"/>
-        </w:numPr>
-      </w:pPr>
-      <w:r>
-        <w:t xml:space="preserve">Son mediciones directas, no estimaciones de un modelo.</w:t>
-      </w:r>
-    </w:p>
-    <w:p>
-      <w:pPr>
-        <w:pStyle w:val="ListParagraph"/>
-        <w:numPr>
-          <w:ilvl w:val="0"/>
-          <w:numId w:val="4"/>
-        </w:numPr>
-      </w:pPr>
-      <w:r>
-        <w:t xml:space="preserve">Diez años dan 3,653 observaciones, suficientes para separar entrenamiento y prueba por tiempo.</w:t>
-      </w:r>
-    </w:p>
-    <w:p>
-      <w:pPr/>
-      <w:r>
-        <w:rPr>
-          <w:b/>
-        </w:rPr>
-        <w:t xml:space="preserve">Periodo:</w:t>
-      </w:r>
-      <w:r>
-        <w:t xml:space="preserve"> desde 2015 ya operaba la red actual de PM2.5 (más de 20 estaciones), y 2024 es el último año completo.</w:t>
-      </w:r>
-    </w:p>
-    <w:p>
-      <w:pPr/>
-      <w:r>
-        <w:rPr>
-          <w:b/>
-        </w:rPr>
-        <w:t xml:space="preserve">Problema detectado:</w:t>
-      </w:r>
-      <w:r>
-        <w:t xml:space="preserve"> en 2024 la velocidad del viento se duplica en todas las estaciones y en todos los meses, aunque el archivo declara la misma unidad (m/s). Es un cambio de escala no documentado, así que el viento de 2024 se marca como faltante.</w:t>
-      </w:r>
-    </w:p>
-    <w:p>
-      <w:pPr>
-        <w:pStyle w:val="Heading2"/>
-      </w:pPr>
-      <w:r>
-        <w:t xml:space="preserve">6. Construcción del dataset para exploración</w:t>
-      </w:r>
-    </w:p>
-    <w:p>
-      <w:pPr/>
-      <w:r>
-        <w:t xml:space="preserve">El dataset final tiene un renglón por día (3,653) y 37 columnas. Se construye en el notebook en 1-2 minutos, con estos pasos:</w:t>
       </w:r>
     </w:p>
     <w:p>
@@ -1972,22 +2626,7 @@
         </w:numPr>
       </w:pPr>
       <w:r>
-        <w:rPr>
-          <w:b/>
-        </w:rPr>
-        <w:t xml:space="preserve">Descarga.</w:t>
-      </w:r>
-      <w:r>
-        <w:t xml:space="preserve"> Se baja un archivo de contaminantes y uno de meteorología por año del portal de la SEDEMA. Si ya están en </w:t>
-      </w:r>
-      <w:r>
-        <w:rPr>
-          <w:rStyle w:val="CodeChar"/>
-        </w:rPr>
-        <w:t xml:space="preserve">datos/rama/</w:t>
-      </w:r>
-      <w:r>
-        <w:t xml:space="preserve">, no se vuelven a descargar.</w:t>
+        <w:t xml:space="preserve">Tienen la resolución que pide la pregunta: día a día, no promedios anuales ni censales.</w:t>
       </w:r>
     </w:p>
     <w:p>
@@ -1999,13 +2638,7 @@
         </w:numPr>
       </w:pPr>
       <w:r>
-        <w:rPr>
-          <w:b/>
-        </w:rPr>
-        <w:t xml:space="preserve">Lectura.</w:t>
-      </w:r>
-      <w:r>
-        <w:t xml:space="preserve"> El SIMAT cambió de formato en 2022 y el código maneja los dos (tabla abajo). La hora marca el final del promedio horario, así que se resta una hora para asignar cada medición a su día.</w:t>
+        <w:t xml:space="preserve">Son mediciones directas, no estimaciones de un modelo.</w:t>
       </w:r>
     </w:p>
     <w:p>
@@ -2017,13 +2650,78 @@
         </w:numPr>
       </w:pPr>
       <w:r>
+        <w:t xml:space="preserve">Diez años dan 3,653 observaciones, suficientes para separar entrenamiento y prueba por tiempo.</w:t>
+      </w:r>
+    </w:p>
+    <w:p>
+      <w:pPr/>
+      <w:r>
         <w:rPr>
           <w:b/>
         </w:rPr>
-        <w:t xml:space="preserve">Limpieza.</w:t>
-      </w:r>
-      <w:r>
-        <w:t xml:space="preserve"> Los valores fuera del rango físico se marcan como faltantes (solo 23 en diez años). El viento de 2024 también.</w:t>
+        <w:t xml:space="preserve">Periodo:</w:t>
+      </w:r>
+      <w:r>
+        <w:t xml:space="preserve"> desde 2015 ya operaba la red actual de PM2.5 (más de 20 estaciones), y 2024 es el último año completo.</w:t>
+      </w:r>
+    </w:p>
+    <w:p>
+      <w:pPr/>
+      <w:r>
+        <w:rPr>
+          <w:b/>
+        </w:rPr>
+        <w:t xml:space="preserve">Problema detectado:</w:t>
+      </w:r>
+      <w:r>
+        <w:t xml:space="preserve"> en 2024 la velocidad del viento se duplica en todas las estaciones y en todos los meses, aunque el archivo declara la misma unidad (m/s). Es un cambio de escala no documentado, así que el viento de 2024 se marca como faltante.</w:t>
+      </w:r>
+    </w:p>
+    <w:p>
+      <w:pPr/>
+      <w:r>
+        <w:rPr>
+          <w:b/>
+        </w:rPr>
+        <w:t xml:space="preserve">Datos del EDA anterior que se conservan:</w:t>
+      </w:r>
+      <w:r>
+        <w:t xml:space="preserve"> el Censo 2020 por localidad (5,085 localidades), los dos rásteres satelitales 2020 recortados a la ZMVM, </w:t>
+      </w:r>
+      <w:r>
+        <w:rPr>
+          <w:rStyle w:val="CodeChar"/>
+        </w:rPr>
+        <w:t xml:space="preserve">cont_loc_mean.csv</w:t>
+      </w:r>
+      <w:r>
+        <w:t xml:space="preserve"> (494 localidades) y los polígonos municipales. Se conservan porque las estaciones solo cubren el centro de la ZMVM: el satélite cubre todas las localidades y el censo dice quién vive en cada una.</w:t>
+      </w:r>
+    </w:p>
+    <w:p>
+      <w:pPr/>
+      <w:r>
+        <w:rPr>
+          <w:b/>
+        </w:rPr>
+        <w:t xml:space="preserve">Cómo se unen:</w:t>
+      </w:r>
+      <w:r>
+        <w:t xml:space="preserve"> la estación es el puente. A cada estación se le asigna el valor del satélite de su celda (para validarlo), y cada localidad recibe su estación más cercana si está a 5 km o menos.</w:t>
+      </w:r>
+    </w:p>
+    <w:p>
+      <w:pPr>
+        <w:pStyle w:val="Heading2"/>
+      </w:pPr>
+      <w:r>
+        <w:t xml:space="preserve">6. Construcción del dataset para exploración</w:t>
+      </w:r>
+    </w:p>
+    <w:p>
+      <w:pPr/>
+      <w:r>
+        <w:t xml:space="preserve">El dataset final tiene un renglón por día (3,653) y 37 columnas. Se construye en el notebook en 1-2 minutos, con estos pasos:</w:t>
       </w:r>
     </w:p>
     <w:p>
@@ -2031,17 +2729,26 @@
         <w:pStyle w:val="ListParagraph"/>
         <w:numPr>
           <w:ilvl w:val="0"/>
-          <w:numId w:val="5"/>
+          <w:numId w:val="6"/>
         </w:numPr>
       </w:pPr>
       <w:r>
         <w:rPr>
           <w:b/>
         </w:rPr>
-        <w:t xml:space="preserve">Promedio diario por estación.</w:t>
-      </w:r>
-      <w:r>
-        <w:t xml:space="preserve"> Se calculan el promedio, el máximo horario y las horas con dato. El promedio solo vale si hay al menos 18 horas (75%), que es el criterio de suficiencia del SIMAT. Para el ozono se calcula también el máximo del promedio móvil de 8 h. El viento se promedia como vector (componentes u y v): un promedio simple entre 350° y 10° daría 180°, la dirección contraria.</w:t>
+        <w:t xml:space="preserve">Descarga.</w:t>
+      </w:r>
+      <w:r>
+        <w:t xml:space="preserve"> Se baja un archivo de contaminantes y uno de meteorología por año del portal de la SEDEMA. Si ya están en </w:t>
+      </w:r>
+      <w:r>
+        <w:rPr>
+          <w:rStyle w:val="CodeChar"/>
+        </w:rPr>
+        <w:t xml:space="preserve">datos/rama/</w:t>
+      </w:r>
+      <w:r>
+        <w:t xml:space="preserve">, no se vuelven a descargar.</w:t>
       </w:r>
     </w:p>
     <w:p>
@@ -2049,17 +2756,17 @@
         <w:pStyle w:val="ListParagraph"/>
         <w:numPr>
           <w:ilvl w:val="0"/>
-          <w:numId w:val="5"/>
+          <w:numId w:val="6"/>
         </w:numPr>
       </w:pPr>
       <w:r>
         <w:rPr>
           <w:b/>
         </w:rPr>
-        <w:t xml:space="preserve">Un renglón por día.</w:t>
-      </w:r>
-      <w:r>
-        <w:t xml:space="preserve"> PM2.5, PM10, NO2, CO y SO2: promedio de las estaciones válidas (y la estación más alta para PM2.5). Ozono: máximo horario en cualquier estación. Meteorología: promedio de estaciones.</w:t>
+        <w:t xml:space="preserve">Lectura.</w:t>
+      </w:r>
+      <w:r>
+        <w:t xml:space="preserve"> El SIMAT cambió de formato en 2022 y el código maneja los dos (tabla abajo). La hora marca el final del promedio horario, así que se resta una hora para asignar cada medición a su día.</w:t>
       </w:r>
     </w:p>
     <w:p>
@@ -2067,17 +2774,17 @@
         <w:pStyle w:val="ListParagraph"/>
         <w:numPr>
           <w:ilvl w:val="0"/>
-          <w:numId w:val="5"/>
+          <w:numId w:val="6"/>
         </w:numPr>
       </w:pPr>
       <w:r>
         <w:rPr>
           <w:b/>
         </w:rPr>
-        <w:t xml:space="preserve">Variables derivadas.</w:t>
-      </w:r>
-      <w:r>
-        <w:t xml:space="preserve"> Calendario, festivos oficiales y Semana Santa, temporada, confinamiento, estacionalidad (seno y coseno del día del año), rezagos de un día y objetivos binarios.</w:t>
+        <w:t xml:space="preserve">Limpieza.</w:t>
+      </w:r>
+      <w:r>
+        <w:t xml:space="preserve"> Los valores fuera del rango físico se marcan como faltantes (solo 23 en diez años). El viento de 2024 también.</w:t>
       </w:r>
     </w:p>
     <w:p>
@@ -2085,7 +2792,61 @@
         <w:pStyle w:val="ListParagraph"/>
         <w:numPr>
           <w:ilvl w:val="0"/>
-          <w:numId w:val="5"/>
+          <w:numId w:val="6"/>
+        </w:numPr>
+      </w:pPr>
+      <w:r>
+        <w:rPr>
+          <w:b/>
+        </w:rPr>
+        <w:t xml:space="preserve">Promedio diario por estación.</w:t>
+      </w:r>
+      <w:r>
+        <w:t xml:space="preserve"> Se calculan el promedio, el máximo horario y las horas con dato. El promedio solo vale si hay al menos 18 horas (75%), que es el criterio de suficiencia del SIMAT. Para el ozono se calcula también el máximo del promedio móvil de 8 h. El viento se promedia como vector (componentes u y v): un promedio simple entre 350° y 10° daría 180°, la dirección contraria.</w:t>
+      </w:r>
+    </w:p>
+    <w:p>
+      <w:pPr>
+        <w:pStyle w:val="ListParagraph"/>
+        <w:numPr>
+          <w:ilvl w:val="0"/>
+          <w:numId w:val="6"/>
+        </w:numPr>
+      </w:pPr>
+      <w:r>
+        <w:rPr>
+          <w:b/>
+        </w:rPr>
+        <w:t xml:space="preserve">Un renglón por día.</w:t>
+      </w:r>
+      <w:r>
+        <w:t xml:space="preserve"> PM2.5, PM10, NO2, CO y SO2: promedio de las estaciones válidas (y la estación más alta para PM2.5). Ozono: máximo horario en cualquier estación. Meteorología: promedio de estaciones.</w:t>
+      </w:r>
+    </w:p>
+    <w:p>
+      <w:pPr>
+        <w:pStyle w:val="ListParagraph"/>
+        <w:numPr>
+          <w:ilvl w:val="0"/>
+          <w:numId w:val="6"/>
+        </w:numPr>
+      </w:pPr>
+      <w:r>
+        <w:rPr>
+          <w:b/>
+        </w:rPr>
+        <w:t xml:space="preserve">Variables derivadas.</w:t>
+      </w:r>
+      <w:r>
+        <w:t xml:space="preserve"> Calendario, festivos oficiales y Semana Santa, temporada, confinamiento, estacionalidad (seno y coseno del día del año), rezagos de un día y objetivos binarios.</w:t>
+      </w:r>
+    </w:p>
+    <w:p>
+      <w:pPr>
+        <w:pStyle w:val="ListParagraph"/>
+        <w:numPr>
+          <w:ilvl w:val="0"/>
+          <w:numId w:val="6"/>
         </w:numPr>
       </w:pPr>
       <w:r>
@@ -2306,7 +3067,7 @@
         <w:pStyle w:val="ListParagraph"/>
         <w:numPr>
           <w:ilvl w:val="0"/>
-          <w:numId w:val="6"/>
+          <w:numId w:val="7"/>
         </w:numPr>
       </w:pPr>
       <w:r>
@@ -2324,7 +3085,7 @@
         <w:pStyle w:val="ListParagraph"/>
         <w:numPr>
           <w:ilvl w:val="0"/>
-          <w:numId w:val="6"/>
+          <w:numId w:val="7"/>
         </w:numPr>
       </w:pPr>
       <w:r>
@@ -2342,7 +3103,7 @@
         <w:pStyle w:val="ListParagraph"/>
         <w:numPr>
           <w:ilvl w:val="0"/>
-          <w:numId w:val="6"/>
+          <w:numId w:val="7"/>
         </w:numPr>
       </w:pPr>
       <w:r>
@@ -2937,6 +3698,137 @@
     </w:p>
     <w:p>
       <w:pPr>
+        <w:pStyle w:val="Heading3"/>
+      </w:pPr>
+      <w:r>
+        <w:t xml:space="preserve">Parte B: dataset por localidad (EDA anterior + estaciones)</w:t>
+      </w:r>
+    </w:p>
+    <w:p>
+      <w:pPr/>
+      <w:r>
+        <w:t xml:space="preserve">El dataset por localidad tiene 5,085 renglones y 32 columnas. Reutiliza las funciones del EDA anterior (conversión de coordenadas, media ponderada, quintiles ponderados por población).</w:t>
+      </w:r>
+    </w:p>
+    <w:p>
+      <w:pPr>
+        <w:pStyle w:val="ListParagraph"/>
+        <w:numPr>
+          <w:ilvl w:val="0"/>
+          <w:numId w:val="8"/>
+        </w:numPr>
+      </w:pPr>
+      <w:r>
+        <w:rPr>
+          <w:b/>
+        </w:rPr>
+        <w:t xml:space="preserve">Resumen por estación</w:t>
+      </w:r>
+      <w:r>
+        <w:t xml:space="preserve"> (</w:t>
+      </w:r>
+      <w:r>
+        <w:rPr>
+          <w:rStyle w:val="CodeChar"/>
+        </w:rPr>
+        <w:t xml:space="preserve">resumen_estaciones.csv</w:t>
+      </w:r>
+      <w:r>
+        <w:t xml:space="preserve">, 36 estaciones con al menos un año de datos). Con los datos diarios de la Parte A se calculan los días al año sobre la norma (PM2.5 &gt; 41 µg/m³, ozono &gt; 90 ppb), normalizados por los días con dato. También el promedio de 2020 de PM2.5 y NO2, y el valor del satélite en la celda de la estación.</w:t>
+      </w:r>
+    </w:p>
+    <w:p>
+      <w:pPr>
+        <w:pStyle w:val="ListParagraph"/>
+        <w:numPr>
+          <w:ilvl w:val="0"/>
+          <w:numId w:val="8"/>
+        </w:numPr>
+      </w:pPr>
+      <w:r>
+        <w:rPr>
+          <w:b/>
+        </w:rPr>
+        <w:t xml:space="preserve">Localidades.</w:t>
+      </w:r>
+      <w:r>
+        <w:t xml:space="preserve"> A cada localidad del censo se le asignan el satélite (celda más cercana), los promedios de </w:t>
+      </w:r>
+      <w:r>
+        <w:rPr>
+          <w:rStyle w:val="CodeChar"/>
+        </w:rPr>
+        <w:t xml:space="preserve">cont_loc_mean.csv</w:t>
+      </w:r>
+      <w:r>
+        <w:t xml:space="preserve"> (solo CDMX) y la estación más cercana que mide ozono y la que mide PM2.5, con la distancia en km (haversine).</w:t>
+      </w:r>
+    </w:p>
+    <w:p>
+      <w:pPr>
+        <w:pStyle w:val="ListParagraph"/>
+        <w:numPr>
+          <w:ilvl w:val="0"/>
+          <w:numId w:val="8"/>
+        </w:numPr>
+      </w:pPr>
+      <w:r>
+        <w:rPr>
+          <w:b/>
+        </w:rPr>
+        <w:t xml:space="preserve">Radio de 5 km.</w:t>
+      </w:r>
+      <w:r>
+        <w:t xml:space="preserve"> Los días sobre la norma solo se asignan si la estación está a 5 km o menos. Así quedan 438 localidades con ozono (61% de la población) y 243 con PM2.5 (43%).</w:t>
+      </w:r>
+    </w:p>
+    <w:p>
+      <w:pPr>
+        <w:pStyle w:val="ListParagraph"/>
+        <w:numPr>
+          <w:ilvl w:val="0"/>
+          <w:numId w:val="8"/>
+        </w:numPr>
+      </w:pPr>
+      <w:r>
+        <w:rPr>
+          <w:b/>
+        </w:rPr>
+        <w:t xml:space="preserve">Indicadores:</w:t>
+      </w:r>
+      <w:r>
+        <w:t xml:space="preserve"> % de población de 0 a 14 años, % de 65 o más, % sin derechohabiencia y % de viviendas con auto.</w:t>
+      </w:r>
+    </w:p>
+    <w:p>
+      <w:pPr>
+        <w:pStyle w:val="ListParagraph"/>
+        <w:numPr>
+          <w:ilvl w:val="0"/>
+          <w:numId w:val="8"/>
+        </w:numPr>
+      </w:pPr>
+      <w:r>
+        <w:rPr>
+          <w:b/>
+        </w:rPr>
+        <w:t xml:space="preserve">Salida:</w:t>
+      </w:r>
+      <w:r>
+        <w:t xml:space="preserve"> </w:t>
+      </w:r>
+      <w:r>
+        <w:rPr>
+          <w:rStyle w:val="CodeChar"/>
+        </w:rPr>
+        <w:t xml:space="preserve">datos/dataset_localidades.csv</w:t>
+      </w:r>
+      <w:r>
+        <w:t xml:space="preserve">.</w:t>
+      </w:r>
+    </w:p>
+    <w:p>
+      <w:pPr>
         <w:pStyle w:val="Heading2"/>
       </w:pPr>
       <w:r>
@@ -2946,7 +3838,16 @@
     <w:p>
       <w:pPr/>
       <w:r>
-        <w:t xml:space="preserve">El clima del día (temperatura, amplitud térmica, humedad y viento) es la variable con más relación con la contaminación diaria; el día de la semana casi no influye.</w:t>
+        <w:t xml:space="preserve">En el tiempo (Parte A), el clima del día es lo que más se relaciona con la contaminación diaria, y el día de la semana casi no influye. En el espacio (Parte B), el satélite de NO2 es confiable pero el de PM2.5 no, y el ozono golpea más al sur de la ciudad.</w:t>
+      </w:r>
+    </w:p>
+    <w:p>
+      <w:pPr/>
+      <w:r>
+        <w:rPr>
+          <w:b/>
+        </w:rPr>
+        <w:t xml:space="preserve">Parte A: análisis temporal (dataset diario)</w:t>
       </w:r>
     </w:p>
     <w:p>
@@ -3793,7 +4694,7 @@
         <w:pStyle w:val="ListParagraph"/>
         <w:numPr>
           <w:ilvl w:val="0"/>
-          <w:numId w:val="7"/>
+          <w:numId w:val="9"/>
         </w:numPr>
       </w:pPr>
       <w:r>
@@ -3823,7 +4724,7 @@
         <w:pStyle w:val="ListParagraph"/>
         <w:numPr>
           <w:ilvl w:val="0"/>
-          <w:numId w:val="7"/>
+          <w:numId w:val="9"/>
         </w:numPr>
       </w:pPr>
       <w:r>
@@ -3862,7 +4763,7 @@
                     <pic:cNvPicPr/>
                   </pic:nvPicPr>
                   <pic:blipFill>
-                    <a:blip r:embed="rId10"/>
+                    <a:blip r:embed="rId12"/>
                     <a:stretch>
                       <a:fillRect/>
                     </a:stretch>
@@ -3898,7 +4799,7 @@
                     <pic:cNvPicPr/>
                   </pic:nvPicPr>
                   <pic:blipFill>
-                    <a:blip r:embed="rId11"/>
+                    <a:blip r:embed="rId13"/>
                     <a:stretch>
                       <a:fillRect/>
                     </a:stretch>
@@ -3924,7 +4825,7 @@
         <w:pStyle w:val="ListParagraph"/>
         <w:numPr>
           <w:ilvl w:val="0"/>
-          <w:numId w:val="8"/>
+          <w:numId w:val="10"/>
         </w:numPr>
       </w:pPr>
       <w:r>
@@ -3942,7 +4843,7 @@
         <w:pStyle w:val="ListParagraph"/>
         <w:numPr>
           <w:ilvl w:val="0"/>
-          <w:numId w:val="8"/>
+          <w:numId w:val="10"/>
         </w:numPr>
       </w:pPr>
       <w:r>
@@ -3974,7 +4875,7 @@
         <w:pStyle w:val="ListParagraph"/>
         <w:numPr>
           <w:ilvl w:val="0"/>
-          <w:numId w:val="9"/>
+          <w:numId w:val="11"/>
         </w:numPr>
       </w:pPr>
       <w:r>
@@ -3992,7 +4893,7 @@
         <w:pStyle w:val="ListParagraph"/>
         <w:numPr>
           <w:ilvl w:val="0"/>
-          <w:numId w:val="9"/>
+          <w:numId w:val="11"/>
         </w:numPr>
       </w:pPr>
       <w:r>
@@ -4010,7 +4911,7 @@
         <w:pStyle w:val="ListParagraph"/>
         <w:numPr>
           <w:ilvl w:val="0"/>
-          <w:numId w:val="9"/>
+          <w:numId w:val="11"/>
         </w:numPr>
       </w:pPr>
       <w:r>
@@ -4052,7 +4953,7 @@
                     <pic:cNvPicPr/>
                   </pic:nvPicPr>
                   <pic:blipFill>
-                    <a:blip r:embed="rId12"/>
+                    <a:blip r:embed="rId14"/>
                     <a:stretch>
                       <a:fillRect/>
                     </a:stretch>
@@ -4078,7 +4979,7 @@
         <w:pStyle w:val="ListParagraph"/>
         <w:numPr>
           <w:ilvl w:val="0"/>
-          <w:numId w:val="10"/>
+          <w:numId w:val="12"/>
         </w:numPr>
       </w:pPr>
       <w:r>
@@ -4096,7 +4997,7 @@
         <w:pStyle w:val="ListParagraph"/>
         <w:numPr>
           <w:ilvl w:val="0"/>
-          <w:numId w:val="10"/>
+          <w:numId w:val="12"/>
         </w:numPr>
       </w:pPr>
       <w:r>
@@ -4114,7 +5015,7 @@
         <w:pStyle w:val="ListParagraph"/>
         <w:numPr>
           <w:ilvl w:val="0"/>
-          <w:numId w:val="10"/>
+          <w:numId w:val="12"/>
         </w:numPr>
       </w:pPr>
       <w:r>
@@ -4141,437 +5042,6 @@
                 <pic:pic xmlns:pic="http://schemas.openxmlformats.org/drawingml/2006/picture">
                   <pic:nvPicPr>
                     <pic:cNvPr id="4" name="image4" descr="Estacionalidad por mes, día de la semana y hora"/>
-                    <pic:cNvPicPr/>
-                  </pic:nvPicPr>
-                  <pic:blipFill>
-                    <a:blip r:embed="rId13"/>
-                    <a:stretch>
-                      <a:fillRect/>
-                    </a:stretch>
-                  </pic:blipFill>
-                  <pic:spPr>
-                    <a:xfrm>
-                      <a:off x="0" y="0"/>
-                      <a:ext cx="5486400" cy="2714496"/>
-                    </a:xfrm>
-                    <a:prstGeom prst="rect">
-                      <a:avLst/>
-                    </a:prstGeom>
-                  </pic:spPr>
-                </pic:pic>
-              </a:graphicData>
-            </a:graphic>
-          </wp:inline>
-        </w:drawing>
-      </w:r>
-    </w:p>
-    <w:p>
-      <w:pPr>
-        <w:pStyle w:val="ListParagraph"/>
-        <w:numPr>
-          <w:ilvl w:val="0"/>
-          <w:numId w:val="11"/>
-        </w:numPr>
-      </w:pPr>
-      <w:r>
-        <w:rPr>
-          <w:b/>
-        </w:rPr>
-        <w:t xml:space="preserve">Por mes:</w:t>
-      </w:r>
-      <w:r>
-        <w:t xml:space="preserve"> el ozono sube de enero a mayo (88 → 125 ppb), y en abril y mayo el 88-91% de los días rebasan la norma. El PM2.5 tiene dos picos: diciembre-enero (inversiones térmicas, festividades) y abril-mayo (incendios, temporada seca). De agosto a octubre las lluvias lo bajan a 15-16 µg/m³.</w:t>
-      </w:r>
-    </w:p>
-    <w:p>
-      <w:pPr>
-        <w:pStyle w:val="ListParagraph"/>
-        <w:numPr>
-          <w:ilvl w:val="0"/>
-          <w:numId w:val="11"/>
-        </w:numPr>
-      </w:pPr>
-      <w:r>
-        <w:rPr>
-          <w:b/>
-        </w:rPr>
-        <w:t xml:space="preserve">Por día de la semana:</w:t>
-      </w:r>
-      <w:r>
-        <w:t xml:space="preserve"> las diferencias son de 1 µg/m³ y 4 ppb, sin significancia estadística (7.7).</w:t>
-      </w:r>
-    </w:p>
-    <w:p>
-      <w:pPr>
-        <w:pStyle w:val="ListParagraph"/>
-        <w:numPr>
-          <w:ilvl w:val="0"/>
-          <w:numId w:val="11"/>
-        </w:numPr>
-      </w:pPr>
-      <w:r>
-        <w:rPr>
-          <w:b/>
-        </w:rPr>
-        <w:t xml:space="preserve">Por hora:</w:t>
-      </w:r>
-      <w:r>
-        <w:t xml:space="preserve"> el ozono es mínimo a las 6-7 h (6 ppb) y máximo a las 14-15 h (69 ppb), igual que la temperatura. El PM2.5 llega a su máximo entre las 10 y las 12 h (29 µg/m³), después de la hora pico de tráfico y con el viento todavía débil.</w:t>
-      </w:r>
-    </w:p>
-    <w:p>
-      <w:pPr>
-        <w:pStyle w:val="Heading3"/>
-      </w:pPr>
-      <w:r>
-        <w:t xml:space="preserve">7.7 Comparación entre grupos</w:t>
-      </w:r>
-    </w:p>
-    <w:p>
-      <w:pPr/>
-      <w:r>
-        <w:t xml:space="preserve">Usamos pruebas no paramétricas porque PM2.5 no es normal.</w:t>
-      </w:r>
-    </w:p>
-    <w:tbl>
-      <w:tblPr>
-        <w:tblStyle w:val="TableGrid"/>
-        <w:tblW w:w="0" w:type="auto"/>
-        <w:tblLayout w:type="fixed"/>
-        <w:tblLook w:val="04A0" w:firstRow="1" w:lastRow="0" w:firstColumn="0" w:lastColumn="0" w:noHBand="0" w:noVBand="1"/>
-      </w:tblPr>
-      <w:tblGrid>
-        <w:gridCol w:w="3120"/>
-        <w:gridCol w:w="3120"/>
-        <w:gridCol w:w="3120"/>
-      </w:tblGrid>
-      <w:tr>
-        <w:trPr>
-          <w:tblHeader/>
-        </w:trPr>
-        <w:tc>
-          <w:tcPr>
-            <w:tcW w:w="3120" w:type="dxa"/>
-            <w:shd w:val="clear" w:color="auto" w:fill="F2F2F2"/>
-          </w:tcPr>
-          <w:p>
-            <w:pPr/>
-            <w:r>
-              <w:t xml:space="preserve">Comparación</w:t>
-            </w:r>
-          </w:p>
-        </w:tc>
-        <w:tc>
-          <w:tcPr>
-            <w:tcW w:w="3120" w:type="dxa"/>
-            <w:shd w:val="clear" w:color="auto" w:fill="F2F2F2"/>
-          </w:tcPr>
-          <w:p>
-            <w:pPr/>
-            <w:r>
-              <w:t xml:space="preserve">PM2.5</w:t>
-            </w:r>
-          </w:p>
-        </w:tc>
-        <w:tc>
-          <w:tcPr>
-            <w:tcW w:w="3120" w:type="dxa"/>
-            <w:shd w:val="clear" w:color="auto" w:fill="F2F2F2"/>
-          </w:tcPr>
-          <w:p>
-            <w:pPr/>
-            <w:r>
-              <w:t xml:space="preserve">Ozono</w:t>
-            </w:r>
-          </w:p>
-        </w:tc>
-      </w:tr>
-      <w:tr>
-        <w:tc>
-          <w:tcPr>
-            <w:tcW w:w="3120" w:type="dxa"/>
-          </w:tcPr>
-          <w:p>
-            <w:pPr/>
-            <w:r>
-              <w:t xml:space="preserve">3 temporadas (Kruskal-Wallis)</w:t>
-            </w:r>
-          </w:p>
-        </w:tc>
-        <w:tc>
-          <w:tcPr>
-            <w:tcW w:w="3120" w:type="dxa"/>
-          </w:tcPr>
-          <w:p>
-            <w:pPr/>
-            <w:r>
-              <w:t xml:space="preserve">H = 942, p &lt; 0.001</w:t>
-            </w:r>
-          </w:p>
-        </w:tc>
-        <w:tc>
-          <w:tcPr>
-            <w:tcW w:w="3120" w:type="dxa"/>
-          </w:tcPr>
-          <w:p>
-            <w:pPr/>
-            <w:r>
-              <w:t xml:space="preserve">H = 439, p &lt; 0.001</w:t>
-            </w:r>
-          </w:p>
-        </w:tc>
-      </w:tr>
-      <w:tr>
-        <w:tc>
-          <w:tcPr>
-            <w:tcW w:w="3120" w:type="dxa"/>
-          </w:tcPr>
-          <w:p>
-            <w:pPr/>
-            <w:r>
-              <w:t xml:space="preserve">Entre semana vs. fin de semana (Mann-Whitney)</w:t>
-            </w:r>
-          </w:p>
-        </w:tc>
-        <w:tc>
-          <w:tcPr>
-            <w:tcW w:w="3120" w:type="dxa"/>
-          </w:tcPr>
-          <w:p>
-            <w:pPr/>
-            <w:r>
-              <w:t xml:space="preserve">p = 0.18 (no significativa)</w:t>
-            </w:r>
-          </w:p>
-        </w:tc>
-        <w:tc>
-          <w:tcPr>
-            <w:tcW w:w="3120" w:type="dxa"/>
-          </w:tcPr>
-          <w:p>
-            <w:pPr/>
-            <w:r>
-              <w:t xml:space="preserve">p = 0.61 (no significativa)</w:t>
-            </w:r>
-          </w:p>
-        </w:tc>
-      </w:tr>
-      <w:tr>
-        <w:tc>
-          <w:tcPr>
-            <w:tcW w:w="3120" w:type="dxa"/>
-          </w:tcPr>
-          <w:p>
-            <w:pPr/>
-            <w:r>
-              <w:t xml:space="preserve">Mediana en seca caliente / seca fría / lluvias</w:t>
-            </w:r>
-          </w:p>
-        </w:tc>
-        <w:tc>
-          <w:tcPr>
-            <w:tcW w:w="3120" w:type="dxa"/>
-          </w:tcPr>
-          <w:p>
-            <w:pPr/>
-            <w:r>
-              <w:t xml:space="preserve">24.1 / 22.7 / 15.8 µg/m³</w:t>
-            </w:r>
-          </w:p>
-        </w:tc>
-        <w:tc>
-          <w:tcPr>
-            <w:tcW w:w="3120" w:type="dxa"/>
-          </w:tcPr>
-          <w:p>
-            <w:pPr/>
-            <w:r>
-              <w:t xml:space="preserve">118 / 93 / 100 ppb</w:t>
-            </w:r>
-          </w:p>
-        </w:tc>
-      </w:tr>
-      <w:tr>
-        <w:tc>
-          <w:tcPr>
-            <w:tcW w:w="3120" w:type="dxa"/>
-          </w:tcPr>
-          <w:p>
-            <w:pPr/>
-            <w:r>
-              <w:t xml:space="preserve">Confinamiento 2020 vs. mismo periodo 2017-2019</w:t>
-            </w:r>
-          </w:p>
-        </w:tc>
-        <w:tc>
-          <w:tcPr>
-            <w:tcW w:w="3120" w:type="dxa"/>
-          </w:tcPr>
-          <w:p>
-            <w:pPr/>
-            <w:r>
-              <w:t xml:space="preserve">−13.5%</w:t>
-            </w:r>
-          </w:p>
-        </w:tc>
-        <w:tc>
-          <w:tcPr>
-            <w:tcW w:w="3120" w:type="dxa"/>
-          </w:tcPr>
-          <w:p>
-            <w:pPr/>
-            <w:r>
-              <w:t xml:space="preserve">−4.5%</w:t>
-            </w:r>
-          </w:p>
-        </w:tc>
-      </w:tr>
-    </w:tbl>
-    <w:p>
-      <w:pPr/>
-      <w:r>
-        <w:t xml:space="preserve">En el confinamiento el CO bajó 40% y el NO2 30%, pero el ozono solo 4.5%. Es un experimento natural: reducir mucho el tráfico no bajó el ozono en la misma proporción.</w:t>
-      </w:r>
-    </w:p>
-    <w:p>
-      <w:pPr>
-        <w:pStyle w:val="Heading3"/>
-      </w:pPr>
-      <w:r>
-        <w:t xml:space="preserve">7.8 Correlaciones y multicolinealidad</w:t>
-      </w:r>
-    </w:p>
-    <w:p>
-      <w:pPr/>
-      <w:r>
-        <w:drawing>
-          <wp:inline distT="0" distB="0" distL="0" distR="0">
-            <wp:extent cx="5486400" cy="2211863"/>
-            <wp:docPr id="5" name="image5" descr="Correlaciones de Spearman"/>
-            <a:graphic xmlns:a="http://schemas.openxmlformats.org/drawingml/2006/main">
-              <a:graphicData uri="http://schemas.openxmlformats.org/drawingml/2006/picture">
-                <pic:pic xmlns:pic="http://schemas.openxmlformats.org/drawingml/2006/picture">
-                  <pic:nvPicPr>
-                    <pic:cNvPr id="5" name="image5" descr="Correlaciones de Spearman"/>
-                    <pic:cNvPicPr/>
-                  </pic:nvPicPr>
-                  <pic:blipFill>
-                    <a:blip r:embed="rId14"/>
-                    <a:stretch>
-                      <a:fillRect/>
-                    </a:stretch>
-                  </pic:blipFill>
-                  <pic:spPr>
-                    <a:xfrm>
-                      <a:off x="0" y="0"/>
-                      <a:ext cx="5486400" cy="2211863"/>
-                    </a:xfrm>
-                    <a:prstGeom prst="rect">
-                      <a:avLst/>
-                    </a:prstGeom>
-                  </pic:spPr>
-                </pic:pic>
-              </a:graphicData>
-            </a:graphic>
-          </wp:inline>
-        </w:drawing>
-      </w:r>
-    </w:p>
-    <w:p>
-      <w:pPr>
-        <w:pStyle w:val="ListParagraph"/>
-        <w:numPr>
-          <w:ilvl w:val="0"/>
-          <w:numId w:val="12"/>
-        </w:numPr>
-      </w:pPr>
-      <w:r>
-        <w:rPr>
-          <w:b/>
-        </w:rPr>
-        <w:t xml:space="preserve">PM2.5:</w:t>
-      </w:r>
-      <w:r>
-        <w:t xml:space="preserve"> se relaciona con su valor del día anterior (ρ = 0.72), la amplitud térmica (0.43) y la estacionalidad, y negativamente con el viento (−0.40) y la humedad (−0.35).</w:t>
-      </w:r>
-    </w:p>
-    <w:p>
-      <w:pPr>
-        <w:pStyle w:val="ListParagraph"/>
-        <w:numPr>
-          <w:ilvl w:val="0"/>
-          <w:numId w:val="12"/>
-        </w:numPr>
-      </w:pPr>
-      <w:r>
-        <w:rPr>
-          <w:b/>
-        </w:rPr>
-        <w:t xml:space="preserve">Ozono:</w:t>
-      </w:r>
-      <w:r>
-        <w:t xml:space="preserve"> se relaciona con la temperatura máxima (ρ = 0.62), su valor del día anterior (0.58) y la amplitud térmica (0.45), y negativamente con la humedad (−0.30).</w:t>
-      </w:r>
-    </w:p>
-    <w:p>
-      <w:pPr>
-        <w:pStyle w:val="ListParagraph"/>
-        <w:numPr>
-          <w:ilvl w:val="0"/>
-          <w:numId w:val="12"/>
-        </w:numPr>
-      </w:pPr>
-      <w:r>
-        <w:t xml:space="preserve">Fin de semana, festivos y confinamiento tienen correlación casi nula con los valores diarios.</w:t>
-      </w:r>
-    </w:p>
-    <w:p>
-      <w:pPr>
-        <w:pStyle w:val="ListParagraph"/>
-        <w:numPr>
-          <w:ilvl w:val="0"/>
-          <w:numId w:val="12"/>
-        </w:numPr>
-      </w:pPr>
-      <w:r>
-        <w:rPr>
-          <w:rStyle w:val="CodeChar"/>
-        </w:rPr>
-        <w:t xml:space="preserve">tmp_min</w:t>
-      </w:r>
-      <w:r>
-        <w:t xml:space="preserve"> se excluye de las entradas porque es exactamente </w:t>
-      </w:r>
-      <w:r>
-        <w:rPr>
-          <w:rStyle w:val="CodeChar"/>
-        </w:rPr>
-        <w:t xml:space="preserve">tmp_max − amplitud_termica</w:t>
-      </w:r>
-      <w:r>
-        <w:t xml:space="preserve">. Sin ella todos los VIF quedan bajo 5 (el mayor: humedad, 4.8), así que no hay multicolinealidad grave.</w:t>
-      </w:r>
-    </w:p>
-    <w:p>
-      <w:pPr>
-        <w:pStyle w:val="Heading3"/>
-      </w:pPr>
-      <w:r>
-        <w:t xml:space="preserve">7.9 Relación entre meteorología y contaminación</w:t>
-      </w:r>
-    </w:p>
-    <w:p>
-      <w:pPr/>
-      <w:r>
-        <w:drawing>
-          <wp:inline distT="0" distB="0" distL="0" distR="0">
-            <wp:extent cx="5486400" cy="2714496"/>
-            <wp:docPr id="6" name="image6" descr="Meteorología vs. contaminación con mediana por decil"/>
-            <a:graphic xmlns:a="http://schemas.openxmlformats.org/drawingml/2006/main">
-              <a:graphicData uri="http://schemas.openxmlformats.org/drawingml/2006/picture">
-                <pic:pic xmlns:pic="http://schemas.openxmlformats.org/drawingml/2006/picture">
-                  <pic:nvPicPr>
-                    <pic:cNvPr id="6" name="image6" descr="Meteorología vs. contaminación con mediana por decil"/>
                     <pic:cNvPicPr/>
                   </pic:nvPicPr>
                   <pic:blipFill>
@@ -4597,12 +5067,6 @@
       </w:r>
     </w:p>
     <w:p>
-      <w:pPr/>
-      <w:r>
-        <w:t xml:space="preserve">Las relaciones son claras y en buena parte no lineales, lo que justifica probar regresión polinomial y redes neuronales:</w:t>
-      </w:r>
-    </w:p>
-    <w:p>
       <w:pPr>
         <w:pStyle w:val="ListParagraph"/>
         <w:numPr>
@@ -4611,7 +5075,13 @@
         </w:numPr>
       </w:pPr>
       <w:r>
-        <w:t xml:space="preserve">El PM2.5 se mantiene en ≈22 µg/m³ mientras el viento de madrugada es menor a 1.5 m/s, y baja a ≈10 cuando pasa de 2 m/s.</w:t>
+        <w:rPr>
+          <w:b/>
+        </w:rPr>
+        <w:t xml:space="preserve">Por mes:</w:t>
+      </w:r>
+      <w:r>
+        <w:t xml:space="preserve"> el ozono sube de enero a mayo (88 → 125 ppb), y en abril y mayo el 88-91% de los días rebasan la norma. El PM2.5 tiene dos picos: diciembre-enero (inversiones térmicas, festividades) y abril-mayo (incendios, temporada seca). De agosto a octubre las lluvias lo bajan a 15-16 µg/m³.</w:t>
       </w:r>
     </w:p>
     <w:p>
@@ -4623,7 +5093,13 @@
         </w:numPr>
       </w:pPr>
       <w:r>
-        <w:t xml:space="preserve">El PM2.5 sube de ≈11 a ≈23 µg/m³ entre 7 y 13 °C de amplitud térmica y luego se estabiliza.</w:t>
+        <w:rPr>
+          <w:b/>
+        </w:rPr>
+        <w:t xml:space="preserve">Por día de la semana:</w:t>
+      </w:r>
+      <w:r>
+        <w:t xml:space="preserve"> las diferencias son de 1 µg/m³ y 4 ppb, sin significancia estadística (7.7).</w:t>
       </w:r>
     </w:p>
     <w:p>
@@ -4635,7 +5111,271 @@
         </w:numPr>
       </w:pPr>
       <w:r>
-        <w:t xml:space="preserve">El ozono sube casi en línea recta con la temperatura máxima, de ≈60 ppb a 19 °C a ≈125 ppb a 28 °C.</w:t>
+        <w:rPr>
+          <w:b/>
+        </w:rPr>
+        <w:t xml:space="preserve">Por hora:</w:t>
+      </w:r>
+      <w:r>
+        <w:t xml:space="preserve"> el ozono es mínimo a las 6-7 h (6 ppb) y máximo a las 14-15 h (69 ppb), igual que la temperatura. El PM2.5 llega a su máximo entre las 10 y las 12 h (29 µg/m³), después de la hora pico de tráfico y con el viento todavía débil.</w:t>
+      </w:r>
+    </w:p>
+    <w:p>
+      <w:pPr>
+        <w:pStyle w:val="Heading3"/>
+      </w:pPr>
+      <w:r>
+        <w:t xml:space="preserve">7.7 Comparación entre grupos</w:t>
+      </w:r>
+    </w:p>
+    <w:p>
+      <w:pPr/>
+      <w:r>
+        <w:t xml:space="preserve">Usamos pruebas no paramétricas porque PM2.5 no es normal.</w:t>
+      </w:r>
+    </w:p>
+    <w:tbl>
+      <w:tblPr>
+        <w:tblStyle w:val="TableGrid"/>
+        <w:tblW w:w="0" w:type="auto"/>
+        <w:tblLayout w:type="fixed"/>
+        <w:tblLook w:val="04A0" w:firstRow="1" w:lastRow="0" w:firstColumn="0" w:lastColumn="0" w:noHBand="0" w:noVBand="1"/>
+      </w:tblPr>
+      <w:tblGrid>
+        <w:gridCol w:w="3120"/>
+        <w:gridCol w:w="3120"/>
+        <w:gridCol w:w="3120"/>
+      </w:tblGrid>
+      <w:tr>
+        <w:trPr>
+          <w:tblHeader/>
+        </w:trPr>
+        <w:tc>
+          <w:tcPr>
+            <w:tcW w:w="3120" w:type="dxa"/>
+            <w:shd w:val="clear" w:color="auto" w:fill="F2F2F2"/>
+          </w:tcPr>
+          <w:p>
+            <w:pPr/>
+            <w:r>
+              <w:t xml:space="preserve">Comparación</w:t>
+            </w:r>
+          </w:p>
+        </w:tc>
+        <w:tc>
+          <w:tcPr>
+            <w:tcW w:w="3120" w:type="dxa"/>
+            <w:shd w:val="clear" w:color="auto" w:fill="F2F2F2"/>
+          </w:tcPr>
+          <w:p>
+            <w:pPr/>
+            <w:r>
+              <w:t xml:space="preserve">PM2.5</w:t>
+            </w:r>
+          </w:p>
+        </w:tc>
+        <w:tc>
+          <w:tcPr>
+            <w:tcW w:w="3120" w:type="dxa"/>
+            <w:shd w:val="clear" w:color="auto" w:fill="F2F2F2"/>
+          </w:tcPr>
+          <w:p>
+            <w:pPr/>
+            <w:r>
+              <w:t xml:space="preserve">Ozono</w:t>
+            </w:r>
+          </w:p>
+        </w:tc>
+      </w:tr>
+      <w:tr>
+        <w:tc>
+          <w:tcPr>
+            <w:tcW w:w="3120" w:type="dxa"/>
+          </w:tcPr>
+          <w:p>
+            <w:pPr/>
+            <w:r>
+              <w:t xml:space="preserve">3 temporadas (Kruskal-Wallis)</w:t>
+            </w:r>
+          </w:p>
+        </w:tc>
+        <w:tc>
+          <w:tcPr>
+            <w:tcW w:w="3120" w:type="dxa"/>
+          </w:tcPr>
+          <w:p>
+            <w:pPr/>
+            <w:r>
+              <w:t xml:space="preserve">H = 942, p &lt; 0.001</w:t>
+            </w:r>
+          </w:p>
+        </w:tc>
+        <w:tc>
+          <w:tcPr>
+            <w:tcW w:w="3120" w:type="dxa"/>
+          </w:tcPr>
+          <w:p>
+            <w:pPr/>
+            <w:r>
+              <w:t xml:space="preserve">H = 439, p &lt; 0.001</w:t>
+            </w:r>
+          </w:p>
+        </w:tc>
+      </w:tr>
+      <w:tr>
+        <w:tc>
+          <w:tcPr>
+            <w:tcW w:w="3120" w:type="dxa"/>
+          </w:tcPr>
+          <w:p>
+            <w:pPr/>
+            <w:r>
+              <w:t xml:space="preserve">Entre semana vs. fin de semana (Mann-Whitney)</w:t>
+            </w:r>
+          </w:p>
+        </w:tc>
+        <w:tc>
+          <w:tcPr>
+            <w:tcW w:w="3120" w:type="dxa"/>
+          </w:tcPr>
+          <w:p>
+            <w:pPr/>
+            <w:r>
+              <w:t xml:space="preserve">p = 0.18 (no significativa)</w:t>
+            </w:r>
+          </w:p>
+        </w:tc>
+        <w:tc>
+          <w:tcPr>
+            <w:tcW w:w="3120" w:type="dxa"/>
+          </w:tcPr>
+          <w:p>
+            <w:pPr/>
+            <w:r>
+              <w:t xml:space="preserve">p = 0.61 (no significativa)</w:t>
+            </w:r>
+          </w:p>
+        </w:tc>
+      </w:tr>
+      <w:tr>
+        <w:tc>
+          <w:tcPr>
+            <w:tcW w:w="3120" w:type="dxa"/>
+          </w:tcPr>
+          <w:p>
+            <w:pPr/>
+            <w:r>
+              <w:t xml:space="preserve">Mediana en seca caliente / seca fría / lluvias</w:t>
+            </w:r>
+          </w:p>
+        </w:tc>
+        <w:tc>
+          <w:tcPr>
+            <w:tcW w:w="3120" w:type="dxa"/>
+          </w:tcPr>
+          <w:p>
+            <w:pPr/>
+            <w:r>
+              <w:t xml:space="preserve">24.1 / 22.7 / 15.8 µg/m³</w:t>
+            </w:r>
+          </w:p>
+        </w:tc>
+        <w:tc>
+          <w:tcPr>
+            <w:tcW w:w="3120" w:type="dxa"/>
+          </w:tcPr>
+          <w:p>
+            <w:pPr/>
+            <w:r>
+              <w:t xml:space="preserve">118 / 93 / 100 ppb</w:t>
+            </w:r>
+          </w:p>
+        </w:tc>
+      </w:tr>
+      <w:tr>
+        <w:tc>
+          <w:tcPr>
+            <w:tcW w:w="3120" w:type="dxa"/>
+          </w:tcPr>
+          <w:p>
+            <w:pPr/>
+            <w:r>
+              <w:t xml:space="preserve">Confinamiento 2020 vs. mismo periodo 2017-2019</w:t>
+            </w:r>
+          </w:p>
+        </w:tc>
+        <w:tc>
+          <w:tcPr>
+            <w:tcW w:w="3120" w:type="dxa"/>
+          </w:tcPr>
+          <w:p>
+            <w:pPr/>
+            <w:r>
+              <w:t xml:space="preserve">−13.5%</w:t>
+            </w:r>
+          </w:p>
+        </w:tc>
+        <w:tc>
+          <w:tcPr>
+            <w:tcW w:w="3120" w:type="dxa"/>
+          </w:tcPr>
+          <w:p>
+            <w:pPr/>
+            <w:r>
+              <w:t xml:space="preserve">−4.5%</w:t>
+            </w:r>
+          </w:p>
+        </w:tc>
+      </w:tr>
+    </w:tbl>
+    <w:p>
+      <w:pPr/>
+      <w:r>
+        <w:t xml:space="preserve">En el confinamiento el CO bajó 40% y el NO2 30%, pero el ozono solo 4.5%. Es un experimento natural: reducir mucho el tráfico no bajó el ozono en la misma proporción.</w:t>
+      </w:r>
+    </w:p>
+    <w:p>
+      <w:pPr>
+        <w:pStyle w:val="Heading3"/>
+      </w:pPr>
+      <w:r>
+        <w:t xml:space="preserve">7.8 Correlaciones y multicolinealidad</w:t>
+      </w:r>
+    </w:p>
+    <w:p>
+      <w:pPr/>
+      <w:r>
+        <w:drawing>
+          <wp:inline distT="0" distB="0" distL="0" distR="0">
+            <wp:extent cx="5486400" cy="2211863"/>
+            <wp:docPr id="5" name="image5" descr="Correlaciones de Spearman"/>
+            <a:graphic xmlns:a="http://schemas.openxmlformats.org/drawingml/2006/main">
+              <a:graphicData uri="http://schemas.openxmlformats.org/drawingml/2006/picture">
+                <pic:pic xmlns:pic="http://schemas.openxmlformats.org/drawingml/2006/picture">
+                  <pic:nvPicPr>
+                    <pic:cNvPr id="5" name="image5" descr="Correlaciones de Spearman"/>
+                    <pic:cNvPicPr/>
+                  </pic:nvPicPr>
+                  <pic:blipFill>
+                    <a:blip r:embed="rId16"/>
+                    <a:stretch>
+                      <a:fillRect/>
+                    </a:stretch>
+                  </pic:blipFill>
+                  <pic:spPr>
+                    <a:xfrm>
+                      <a:off x="0" y="0"/>
+                      <a:ext cx="5486400" cy="2211863"/>
+                    </a:xfrm>
+                    <a:prstGeom prst="rect">
+                      <a:avLst/>
+                    </a:prstGeom>
+                  </pic:spPr>
+                </pic:pic>
+              </a:graphicData>
+            </a:graphic>
+          </wp:inline>
+        </w:drawing>
       </w:r>
     </w:p>
     <w:p>
@@ -4643,7 +5383,168 @@
         <w:pStyle w:val="ListParagraph"/>
         <w:numPr>
           <w:ilvl w:val="0"/>
-          <w:numId w:val="13"/>
+          <w:numId w:val="14"/>
+        </w:numPr>
+      </w:pPr>
+      <w:r>
+        <w:rPr>
+          <w:b/>
+        </w:rPr>
+        <w:t xml:space="preserve">PM2.5:</w:t>
+      </w:r>
+      <w:r>
+        <w:t xml:space="preserve"> se relaciona con su valor del día anterior (ρ = 0.72), la amplitud térmica (0.43) y la estacionalidad, y negativamente con el viento (−0.40) y la humedad (−0.35).</w:t>
+      </w:r>
+    </w:p>
+    <w:p>
+      <w:pPr>
+        <w:pStyle w:val="ListParagraph"/>
+        <w:numPr>
+          <w:ilvl w:val="0"/>
+          <w:numId w:val="14"/>
+        </w:numPr>
+      </w:pPr>
+      <w:r>
+        <w:rPr>
+          <w:b/>
+        </w:rPr>
+        <w:t xml:space="preserve">Ozono:</w:t>
+      </w:r>
+      <w:r>
+        <w:t xml:space="preserve"> se relaciona con la temperatura máxima (ρ = 0.62), su valor del día anterior (0.58) y la amplitud térmica (0.45), y negativamente con la humedad (−0.30).</w:t>
+      </w:r>
+    </w:p>
+    <w:p>
+      <w:pPr>
+        <w:pStyle w:val="ListParagraph"/>
+        <w:numPr>
+          <w:ilvl w:val="0"/>
+          <w:numId w:val="14"/>
+        </w:numPr>
+      </w:pPr>
+      <w:r>
+        <w:t xml:space="preserve">Fin de semana, festivos y confinamiento tienen correlación casi nula con los valores diarios.</w:t>
+      </w:r>
+    </w:p>
+    <w:p>
+      <w:pPr>
+        <w:pStyle w:val="ListParagraph"/>
+        <w:numPr>
+          <w:ilvl w:val="0"/>
+          <w:numId w:val="14"/>
+        </w:numPr>
+      </w:pPr>
+      <w:r>
+        <w:rPr>
+          <w:rStyle w:val="CodeChar"/>
+        </w:rPr>
+        <w:t xml:space="preserve">tmp_min</w:t>
+      </w:r>
+      <w:r>
+        <w:t xml:space="preserve"> se excluye de las entradas porque es exactamente </w:t>
+      </w:r>
+      <w:r>
+        <w:rPr>
+          <w:rStyle w:val="CodeChar"/>
+        </w:rPr>
+        <w:t xml:space="preserve">tmp_max − amplitud_termica</w:t>
+      </w:r>
+      <w:r>
+        <w:t xml:space="preserve">. Sin ella todos los VIF quedan bajo 5 (el mayor: humedad, 4.8), así que no hay multicolinealidad grave.</w:t>
+      </w:r>
+    </w:p>
+    <w:p>
+      <w:pPr>
+        <w:pStyle w:val="Heading3"/>
+      </w:pPr>
+      <w:r>
+        <w:t xml:space="preserve">7.9 Relación entre meteorología y contaminación</w:t>
+      </w:r>
+    </w:p>
+    <w:p>
+      <w:pPr/>
+      <w:r>
+        <w:drawing>
+          <wp:inline distT="0" distB="0" distL="0" distR="0">
+            <wp:extent cx="5486400" cy="2714496"/>
+            <wp:docPr id="6" name="image6" descr="Meteorología vs. contaminación con mediana por decil"/>
+            <a:graphic xmlns:a="http://schemas.openxmlformats.org/drawingml/2006/main">
+              <a:graphicData uri="http://schemas.openxmlformats.org/drawingml/2006/picture">
+                <pic:pic xmlns:pic="http://schemas.openxmlformats.org/drawingml/2006/picture">
+                  <pic:nvPicPr>
+                    <pic:cNvPr id="6" name="image6" descr="Meteorología vs. contaminación con mediana por decil"/>
+                    <pic:cNvPicPr/>
+                  </pic:nvPicPr>
+                  <pic:blipFill>
+                    <a:blip r:embed="rId17"/>
+                    <a:stretch>
+                      <a:fillRect/>
+                    </a:stretch>
+                  </pic:blipFill>
+                  <pic:spPr>
+                    <a:xfrm>
+                      <a:off x="0" y="0"/>
+                      <a:ext cx="5486400" cy="2714496"/>
+                    </a:xfrm>
+                    <a:prstGeom prst="rect">
+                      <a:avLst/>
+                    </a:prstGeom>
+                  </pic:spPr>
+                </pic:pic>
+              </a:graphicData>
+            </a:graphic>
+          </wp:inline>
+        </w:drawing>
+      </w:r>
+    </w:p>
+    <w:p>
+      <w:pPr/>
+      <w:r>
+        <w:t xml:space="preserve">Las relaciones son claras y en buena parte no lineales, lo que justifica probar regresión polinomial y redes neuronales:</w:t>
+      </w:r>
+    </w:p>
+    <w:p>
+      <w:pPr>
+        <w:pStyle w:val="ListParagraph"/>
+        <w:numPr>
+          <w:ilvl w:val="0"/>
+          <w:numId w:val="15"/>
+        </w:numPr>
+      </w:pPr>
+      <w:r>
+        <w:t xml:space="preserve">El PM2.5 se mantiene en ≈22 µg/m³ mientras el viento de madrugada es menor a 1.5 m/s, y baja a ≈10 cuando pasa de 2 m/s.</w:t>
+      </w:r>
+    </w:p>
+    <w:p>
+      <w:pPr>
+        <w:pStyle w:val="ListParagraph"/>
+        <w:numPr>
+          <w:ilvl w:val="0"/>
+          <w:numId w:val="15"/>
+        </w:numPr>
+      </w:pPr>
+      <w:r>
+        <w:t xml:space="preserve">El PM2.5 sube de ≈11 a ≈23 µg/m³ entre 7 y 13 °C de amplitud térmica y luego se estabiliza.</w:t>
+      </w:r>
+    </w:p>
+    <w:p>
+      <w:pPr>
+        <w:pStyle w:val="ListParagraph"/>
+        <w:numPr>
+          <w:ilvl w:val="0"/>
+          <w:numId w:val="15"/>
+        </w:numPr>
+      </w:pPr>
+      <w:r>
+        <w:t xml:space="preserve">El ozono sube casi en línea recta con la temperatura máxima, de ≈60 ppb a 19 °C a ≈125 ppb a 28 °C.</w:t>
+      </w:r>
+    </w:p>
+    <w:p>
+      <w:pPr>
+        <w:pStyle w:val="ListParagraph"/>
+        <w:numPr>
+          <w:ilvl w:val="0"/>
+          <w:numId w:val="15"/>
         </w:numPr>
       </w:pPr>
       <w:r>
@@ -4673,7 +5574,7 @@
                     <pic:cNvPicPr/>
                   </pic:nvPicPr>
                   <pic:blipFill>
-                    <a:blip r:embed="rId16"/>
+                    <a:blip r:embed="rId18"/>
                     <a:stretch>
                       <a:fillRect/>
                     </a:stretch>
@@ -5049,7 +5950,7 @@
                     <pic:cNvPicPr/>
                   </pic:nvPicPr>
                   <pic:blipFill>
-                    <a:blip r:embed="rId17"/>
+                    <a:blip r:embed="rId19"/>
                     <a:stretch>
                       <a:fillRect/>
                     </a:stretch>
@@ -5075,7 +5976,7 @@
         <w:pStyle w:val="ListParagraph"/>
         <w:numPr>
           <w:ilvl w:val="0"/>
-          <w:numId w:val="14"/>
+          <w:numId w:val="16"/>
         </w:numPr>
       </w:pPr>
       <w:r>
@@ -5086,155 +5987,6 @@
       </w:r>
       <w:r>
         <w:t xml:space="preserve"> solo con la meteorología del día se explica el 59% en años que el modelo no vio. Pesan más el viento (−0.39), la temperatura máxima (+0.38) y la amplitud térmica (+0.37) que el ozono de ayer (+0.30).</w:t>
-      </w:r>
-    </w:p>
-    <w:p>
-      <w:pPr>
-        <w:pStyle w:val="ListParagraph"/>
-        <w:numPr>
-          <w:ilvl w:val="0"/>
-          <w:numId w:val="14"/>
-        </w:numPr>
-      </w:pPr>
-      <w:r>
-        <w:rPr>
-          <w:b/>
-        </w:rPr>
-        <w:t xml:space="preserve">PM2.5:</w:t>
-      </w:r>
-      <w:r>
-        <w:t xml:space="preserve"> depende más de la persistencia (+0.48) y del viento (−0.36), y de eventos puntuales como incendios y pirotecnia; es más difícil de predecir.</w:t>
-      </w:r>
-    </w:p>
-    <w:p>
-      <w:pPr>
-        <w:pStyle w:val="ListParagraph"/>
-        <w:numPr>
-          <w:ilvl w:val="0"/>
-          <w:numId w:val="14"/>
-        </w:numPr>
-      </w:pPr>
-      <w:r>
-        <w:t xml:space="preserve">Los modelos completos superan a la persistencia, y el R² de prueba se parece al de entrenamiento (0.55 y 0.66): no hay sobreajuste y queda espacio para modelos no lineales.</w:t>
-      </w:r>
-    </w:p>
-    <w:p>
-      <w:pPr>
-        <w:pStyle w:val="Heading2"/>
-      </w:pPr>
-      <w:r>
-        <w:t xml:space="preserve">8. Conclusiones</w:t>
-      </w:r>
-    </w:p>
-    <w:p>
-      <w:pPr>
-        <w:pStyle w:val="ListParagraph"/>
-        <w:numPr>
-          <w:ilvl w:val="0"/>
-          <w:numId w:val="15"/>
-        </w:numPr>
-      </w:pPr>
-      <w:r>
-        <w:rPr>
-          <w:b/>
-        </w:rPr>
-        <w:t xml:space="preserve">El dataset se construyó a partir de 24.8 millones de registros horarios</w:t>
-      </w:r>
-      <w:r>
-        <w:t xml:space="preserve"> de dos redes del SIMAT con dos formatos de archivo distintos. Quedó en 3,653 días × 37 variables, y se documentó un problema de calidad que el archivo no declara (el viento de 2024).</w:t>
-      </w:r>
-    </w:p>
-    <w:p>
-      <w:pPr>
-        <w:pStyle w:val="ListParagraph"/>
-        <w:numPr>
-          <w:ilvl w:val="0"/>
-          <w:numId w:val="15"/>
-        </w:numPr>
-      </w:pPr>
-      <w:r>
-        <w:rPr>
-          <w:b/>
-        </w:rPr>
-        <w:t xml:space="preserve">La mala calidad del aire es cotidiana:</w:t>
-      </w:r>
-      <w:r>
-        <w:t xml:space="preserve"> el 75% de los días supera la guía de la OMS para PM2.5, y en el 66% de los días alguna estación rebasa la norma de ozono (90% en abril y mayo).</w:t>
-      </w:r>
-    </w:p>
-    <w:p>
-      <w:pPr>
-        <w:pStyle w:val="ListParagraph"/>
-        <w:numPr>
-          <w:ilvl w:val="0"/>
-          <w:numId w:val="15"/>
-        </w:numPr>
-      </w:pPr>
-      <w:r>
-        <w:rPr>
-          <w:b/>
-        </w:rPr>
-        <w:t xml:space="preserve">El PM2.5 mejoró desde 2020; el ozono no.</w:t>
-      </w:r>
-      <w:r>
-        <w:t xml:space="preserve"> En el confinamiento, el CO y el NO2 bajaron 30-40%, pero el ozono solo 4.5%.</w:t>
-      </w:r>
-    </w:p>
-    <w:p>
-      <w:pPr>
-        <w:pStyle w:val="ListParagraph"/>
-        <w:numPr>
-          <w:ilvl w:val="0"/>
-          <w:numId w:val="15"/>
-        </w:numPr>
-      </w:pPr>
-      <w:r>
-        <w:rPr>
-          <w:b/>
-        </w:rPr>
-        <w:t xml:space="preserve">La meteorología explica gran parte de la variación diaria.</w:t>
-      </w:r>
-      <w:r>
-        <w:t xml:space="preserve"> Un modelo lineal simple explica 59-66% del ozono y 54% del PM2.5 en años que no vio.</w:t>
-      </w:r>
-    </w:p>
-    <w:p>
-      <w:pPr>
-        <w:pStyle w:val="ListParagraph"/>
-        <w:numPr>
-          <w:ilvl w:val="0"/>
-          <w:numId w:val="15"/>
-        </w:numPr>
-      </w:pPr>
-      <w:r>
-        <w:rPr>
-          <w:b/>
-        </w:rPr>
-        <w:t xml:space="preserve">Las relaciones no son lineales y las series tienen autocorrelación.</w:t>
-      </w:r>
-      <w:r>
-        <w:t xml:space="preserve"> Hay que modelar log(PM2.5), evaluar con partición temporal y probar modelos no lineales.</w:t>
-      </w:r>
-    </w:p>
-    <w:p>
-      <w:pPr/>
-      <w:r>
-        <w:rPr>
-          <w:b/>
-        </w:rPr>
-        <w:t xml:space="preserve">Siguiente etapa:</w:t>
-      </w:r>
-      <w:r>
-        <w:t xml:space="preserve"> regresión polinomial y robusta (Huber, por los eventos extremos), redes neuronales y clasificación de los días que rebasan la norma. Agregar la altura de la capa de mezcla y la radiación solar (ERA5), y usar el pronóstico meteorológico en lugar de lo observado, para que el modelo sirva para anticipar.</w:t>
-      </w:r>
-    </w:p>
-    <w:p>
-      <w:pPr/>
-      <w:r>
-        <w:rPr>
-          <w:b/>
-        </w:rPr>
-        <w:t xml:space="preserve">Limitaciones:</w:t>
       </w:r>
     </w:p>
     <w:p>
@@ -5246,7 +5998,13 @@
         </w:numPr>
       </w:pPr>
       <w:r>
-        <w:t xml:space="preserve">Se usa la meteorología observada del mismo día; un pronóstico real usaría la pronosticada.</w:t>
+        <w:rPr>
+          <w:b/>
+        </w:rPr>
+        <w:t xml:space="preserve">PM2.5:</w:t>
+      </w:r>
+      <w:r>
+        <w:t xml:space="preserve"> depende más de la persistencia (+0.48) y del viento (−0.36), y de eventos puntuales como incendios y pirotecnia; es más difícil de predecir.</w:t>
       </w:r>
     </w:p>
     <w:p>
@@ -5258,19 +6016,278 @@
         </w:numPr>
       </w:pPr>
       <w:r>
-        <w:t xml:space="preserve">El promedio entre estaciones mezcla zonas distintas de la ciudad.</w:t>
-      </w:r>
-    </w:p>
+        <w:t xml:space="preserve">Los modelos completos superan a la persistencia, y el R² de prueba se parece al de entrenamiento (0.55 y 0.66): no hay sobreajuste y queda espacio para modelos no lineales.</w:t>
+      </w:r>
+    </w:p>
+    <w:p>
+      <w:pPr/>
+      <w:r>
+        <w:rPr>
+          <w:b/>
+        </w:rPr>
+        <w:t xml:space="preserve">Parte B: análisis espacial (dataset por localidad, EDA anterior + estaciones)</w:t>
+      </w:r>
+    </w:p>
+    <w:p>
+      <w:pPr>
+        <w:pStyle w:val="Heading3"/>
+      </w:pPr>
+      <w:r>
+        <w:t xml:space="preserve">7.12 Validación del satélite con las estaciones (2020)</w:t>
+      </w:r>
+    </w:p>
+    <w:p>
+      <w:pPr/>
+      <w:r>
+        <w:t xml:space="preserve">En el EDA anterior usamos el satélite para todas las localidades sin saber si era confiable. Ahora se compara con lo que midió cada estación de la RAMA en 2020.</w:t>
+      </w:r>
+    </w:p>
+    <w:p>
+      <w:pPr/>
+      <w:r>
+        <w:drawing>
+          <wp:inline distT="0" distB="0" distL="0" distR="0">
+            <wp:extent cx="5486400" cy="2401368"/>
+            <wp:docPr id="9" name="image9" descr="Validación del satélite contra las estaciones en 2020"/>
+            <a:graphic xmlns:a="http://schemas.openxmlformats.org/drawingml/2006/main">
+              <a:graphicData uri="http://schemas.openxmlformats.org/drawingml/2006/picture">
+                <pic:pic xmlns:pic="http://schemas.openxmlformats.org/drawingml/2006/picture">
+                  <pic:nvPicPr>
+                    <pic:cNvPr id="9" name="image9" descr="Validación del satélite contra las estaciones en 2020"/>
+                    <pic:cNvPicPr/>
+                  </pic:nvPicPr>
+                  <pic:blipFill>
+                    <a:blip r:embed="rId20"/>
+                    <a:stretch>
+                      <a:fillRect/>
+                    </a:stretch>
+                  </pic:blipFill>
+                  <pic:spPr>
+                    <a:xfrm>
+                      <a:off x="0" y="0"/>
+                      <a:ext cx="5486400" cy="2401368"/>
+                    </a:xfrm>
+                    <a:prstGeom prst="rect">
+                      <a:avLst/>
+                    </a:prstGeom>
+                  </pic:spPr>
+                </pic:pic>
+              </a:graphicData>
+            </a:graphic>
+          </wp:inline>
+        </w:drawing>
+      </w:r>
+    </w:p>
+    <w:tbl>
+      <w:tblPr>
+        <w:tblStyle w:val="TableGrid"/>
+        <w:tblW w:w="0" w:type="auto"/>
+        <w:tblLayout w:type="fixed"/>
+        <w:tblLook w:val="04A0" w:firstRow="1" w:lastRow="0" w:firstColumn="0" w:lastColumn="0" w:noHBand="0" w:noVBand="1"/>
+      </w:tblPr>
+      <w:tblGrid>
+        <w:gridCol w:w="1872"/>
+        <w:gridCol w:w="1872"/>
+        <w:gridCol w:w="1872"/>
+        <w:gridCol w:w="1872"/>
+        <w:gridCol w:w="1872"/>
+      </w:tblGrid>
+      <w:tr>
+        <w:trPr>
+          <w:tblHeader/>
+        </w:trPr>
+        <w:tc>
+          <w:tcPr>
+            <w:tcW w:w="1872" w:type="dxa"/>
+            <w:shd w:val="clear" w:color="auto" w:fill="F2F2F2"/>
+          </w:tcPr>
+          <w:p>
+            <w:pPr/>
+            <w:r>
+              <w:t xml:space="preserve">Contaminante</w:t>
+            </w:r>
+          </w:p>
+        </w:tc>
+        <w:tc>
+          <w:tcPr>
+            <w:tcW w:w="1872" w:type="dxa"/>
+            <w:shd w:val="clear" w:color="auto" w:fill="F2F2F2"/>
+          </w:tcPr>
+          <w:p>
+            <w:pPr/>
+            <w:r>
+              <w:t xml:space="preserve">Estaciones</w:t>
+            </w:r>
+          </w:p>
+        </w:tc>
+        <w:tc>
+          <w:tcPr>
+            <w:tcW w:w="1872" w:type="dxa"/>
+            <w:shd w:val="clear" w:color="auto" w:fill="F2F2F2"/>
+          </w:tcPr>
+          <w:p>
+            <w:pPr/>
+            <w:r>
+              <w:t xml:space="preserve">Spearman ρ</w:t>
+            </w:r>
+          </w:p>
+        </w:tc>
+        <w:tc>
+          <w:tcPr>
+            <w:tcW w:w="1872" w:type="dxa"/>
+            <w:shd w:val="clear" w:color="auto" w:fill="F2F2F2"/>
+          </w:tcPr>
+          <w:p>
+            <w:pPr/>
+            <w:r>
+              <w:t xml:space="preserve">Sesgo (satélite − estación)</w:t>
+            </w:r>
+          </w:p>
+        </w:tc>
+        <w:tc>
+          <w:tcPr>
+            <w:tcW w:w="1872" w:type="dxa"/>
+            <w:shd w:val="clear" w:color="auto" w:fill="F2F2F2"/>
+          </w:tcPr>
+          <w:p>
+            <w:pPr/>
+            <w:r>
+              <w:t xml:space="preserve">Promedio estaciones / satélite</w:t>
+            </w:r>
+          </w:p>
+        </w:tc>
+      </w:tr>
+      <w:tr>
+        <w:tc>
+          <w:tcPr>
+            <w:tcW w:w="1872" w:type="dxa"/>
+          </w:tcPr>
+          <w:p>
+            <w:pPr/>
+            <w:r>
+              <w:t xml:space="preserve">NO2</w:t>
+            </w:r>
+          </w:p>
+        </w:tc>
+        <w:tc>
+          <w:tcPr>
+            <w:tcW w:w="1872" w:type="dxa"/>
+          </w:tcPr>
+          <w:p>
+            <w:pPr/>
+            <w:r>
+              <w:t xml:space="preserve">28</w:t>
+            </w:r>
+          </w:p>
+        </w:tc>
+        <w:tc>
+          <w:tcPr>
+            <w:tcW w:w="1872" w:type="dxa"/>
+          </w:tcPr>
+          <w:p>
+            <w:pPr/>
+            <w:r>
+              <w:t xml:space="preserve">0.89 (p &lt; 0.001)</w:t>
+            </w:r>
+          </w:p>
+        </w:tc>
+        <w:tc>
+          <w:tcPr>
+            <w:tcW w:w="1872" w:type="dxa"/>
+          </w:tcPr>
+          <w:p>
+            <w:pPr/>
+            <w:r>
+              <w:t xml:space="preserve">−1.9 ppb</w:t>
+            </w:r>
+          </w:p>
+        </w:tc>
+        <w:tc>
+          <w:tcPr>
+            <w:tcW w:w="1872" w:type="dxa"/>
+          </w:tcPr>
+          <w:p>
+            <w:pPr/>
+            <w:r>
+              <w:t xml:space="preserve">19.1 / 17.1 ppb</w:t>
+            </w:r>
+          </w:p>
+        </w:tc>
+      </w:tr>
+      <w:tr>
+        <w:tc>
+          <w:tcPr>
+            <w:tcW w:w="1872" w:type="dxa"/>
+          </w:tcPr>
+          <w:p>
+            <w:pPr/>
+            <w:r>
+              <w:t xml:space="preserve">PM2.5</w:t>
+            </w:r>
+          </w:p>
+        </w:tc>
+        <w:tc>
+          <w:tcPr>
+            <w:tcW w:w="1872" w:type="dxa"/>
+          </w:tcPr>
+          <w:p>
+            <w:pPr/>
+            <w:r>
+              <w:t xml:space="preserve">17</w:t>
+            </w:r>
+          </w:p>
+        </w:tc>
+        <w:tc>
+          <w:tcPr>
+            <w:tcW w:w="1872" w:type="dxa"/>
+          </w:tcPr>
+          <w:p>
+            <w:pPr/>
+            <w:r>
+              <w:t xml:space="preserve">0.08 (p = 0.76)</w:t>
+            </w:r>
+          </w:p>
+        </w:tc>
+        <w:tc>
+          <w:tcPr>
+            <w:tcW w:w="1872" w:type="dxa"/>
+          </w:tcPr>
+          <w:p>
+            <w:pPr/>
+            <w:r>
+              <w:t xml:space="preserve">+4.0 µg/m³</w:t>
+            </w:r>
+          </w:p>
+        </w:tc>
+        <w:tc>
+          <w:tcPr>
+            <w:tcW w:w="1872" w:type="dxa"/>
+          </w:tcPr>
+          <w:p>
+            <w:pPr/>
+            <w:r>
+              <w:t xml:space="preserve">19.1 / 23.1 µg/m³</w:t>
+            </w:r>
+          </w:p>
+        </w:tc>
+      </w:tr>
+    </w:tbl>
     <w:p>
       <w:pPr>
         <w:pStyle w:val="ListParagraph"/>
         <w:numPr>
           <w:ilvl w:val="0"/>
-          <w:numId w:val="16"/>
+          <w:numId w:val="17"/>
         </w:numPr>
       </w:pPr>
       <w:r>
-        <w:t xml:space="preserve">El número de estaciones cambia con los años.</w:t>
+        <w:rPr>
+          <w:b/>
+        </w:rPr>
+        <w:t xml:space="preserve">El satélite de NO2 es confiable:</w:t>
+      </w:r>
+      <w:r>
+        <w:t xml:space="preserve"> reproduce el orden de las estaciones y se puede usar en las localidades sin estación.</w:t>
       </w:r>
     </w:p>
     <w:p>
@@ -5278,7 +6295,711 @@
         <w:pStyle w:val="ListParagraph"/>
         <w:numPr>
           <w:ilvl w:val="0"/>
-          <w:numId w:val="16"/>
+          <w:numId w:val="17"/>
+        </w:numPr>
+      </w:pPr>
+      <w:r>
+        <w:rPr>
+          <w:b/>
+        </w:rPr>
+        <w:t xml:space="preserve">El de PM2.5 no reproduce las diferencias entre estaciones</w:t>
+      </w:r>
+      <w:r>
+        <w:t xml:space="preserve"> y sobreestima 4 µg/m³. Sirve para comparar con la norma anual, no para decir qué zona tiene más PM2.5. Esto corrige una conclusión del EDA anterior.</w:t>
+      </w:r>
+    </w:p>
+    <w:p>
+      <w:pPr>
+        <w:pStyle w:val="Heading3"/>
+      </w:pPr>
+      <w:r>
+        <w:t xml:space="preserve">7.13 Exposición de la población y población vulnerable</w:t>
+      </w:r>
+    </w:p>
+    <w:tbl>
+      <w:tblPr>
+        <w:tblStyle w:val="TableGrid"/>
+        <w:tblW w:w="0" w:type="auto"/>
+        <w:tblLayout w:type="fixed"/>
+        <w:tblLook w:val="04A0" w:firstRow="1" w:lastRow="0" w:firstColumn="0" w:lastColumn="0" w:noHBand="0" w:noVBand="1"/>
+      </w:tblPr>
+      <w:tblGrid>
+        <w:gridCol w:w="3120"/>
+        <w:gridCol w:w="3120"/>
+        <w:gridCol w:w="3120"/>
+      </w:tblGrid>
+      <w:tr>
+        <w:trPr>
+          <w:tblHeader/>
+        </w:trPr>
+        <w:tc>
+          <w:tcPr>
+            <w:tcW w:w="3120" w:type="dxa"/>
+            <w:shd w:val="clear" w:color="auto" w:fill="F2F2F2"/>
+          </w:tcPr>
+          <w:p>
+            <w:pPr/>
+            <w:r>
+              <w:t xml:space="preserve">Indicador</w:t>
+            </w:r>
+          </w:p>
+        </w:tc>
+        <w:tc>
+          <w:tcPr>
+            <w:tcW w:w="3120" w:type="dxa"/>
+            <w:shd w:val="clear" w:color="auto" w:fill="F2F2F2"/>
+          </w:tcPr>
+          <w:p>
+            <w:pPr/>
+            <w:r>
+              <w:t xml:space="preserve">CDMX</w:t>
+            </w:r>
+          </w:p>
+        </w:tc>
+        <w:tc>
+          <w:tcPr>
+            <w:tcW w:w="3120" w:type="dxa"/>
+            <w:shd w:val="clear" w:color="auto" w:fill="F2F2F2"/>
+          </w:tcPr>
+          <w:p>
+            <w:pPr/>
+            <w:r>
+              <w:t xml:space="preserve">Estado de México</w:t>
+            </w:r>
+          </w:p>
+        </w:tc>
+      </w:tr>
+      <w:tr>
+        <w:tc>
+          <w:tcPr>
+            <w:tcW w:w="3120" w:type="dxa"/>
+          </w:tcPr>
+          <w:p>
+            <w:pPr/>
+            <w:r>
+              <w:t xml:space="preserve">Población</w:t>
+            </w:r>
+          </w:p>
+        </w:tc>
+        <w:tc>
+          <w:tcPr>
+            <w:tcW w:w="3120" w:type="dxa"/>
+          </w:tcPr>
+          <w:p>
+            <w:pPr/>
+            <w:r>
+              <w:t xml:space="preserve">9.2 millones</w:t>
+            </w:r>
+          </w:p>
+        </w:tc>
+        <w:tc>
+          <w:tcPr>
+            <w:tcW w:w="3120" w:type="dxa"/>
+          </w:tcPr>
+          <w:p>
+            <w:pPr/>
+            <w:r>
+              <w:t xml:space="preserve">17.0 millones</w:t>
+            </w:r>
+          </w:p>
+        </w:tc>
+      </w:tr>
+      <w:tr>
+        <w:tc>
+          <w:tcPr>
+            <w:tcW w:w="3120" w:type="dxa"/>
+          </w:tcPr>
+          <w:p>
+            <w:pPr/>
+            <w:r>
+              <w:t xml:space="preserve">PM2.5 satelital ponderado por población</w:t>
+            </w:r>
+          </w:p>
+        </w:tc>
+        <w:tc>
+          <w:tcPr>
+            <w:tcW w:w="3120" w:type="dxa"/>
+          </w:tcPr>
+          <w:p>
+            <w:pPr/>
+            <w:r>
+              <w:t xml:space="preserve">23.0 µg/m³</w:t>
+            </w:r>
+          </w:p>
+        </w:tc>
+        <w:tc>
+          <w:tcPr>
+            <w:tcW w:w="3120" w:type="dxa"/>
+          </w:tcPr>
+          <w:p>
+            <w:pPr/>
+            <w:r>
+              <w:t xml:space="preserve">23.5 µg/m³</w:t>
+            </w:r>
+          </w:p>
+        </w:tc>
+      </w:tr>
+      <w:tr>
+        <w:tc>
+          <w:tcPr>
+            <w:tcW w:w="3120" w:type="dxa"/>
+          </w:tcPr>
+          <w:p>
+            <w:pPr/>
+            <w:r>
+              <w:t xml:space="preserve">NO2 satelital ponderado por población</w:t>
+            </w:r>
+          </w:p>
+        </w:tc>
+        <w:tc>
+          <w:tcPr>
+            <w:tcW w:w="3120" w:type="dxa"/>
+          </w:tcPr>
+          <w:p>
+            <w:pPr/>
+            <w:r>
+              <w:t xml:space="preserve">18.3 ppb</w:t>
+            </w:r>
+          </w:p>
+        </w:tc>
+        <w:tc>
+          <w:tcPr>
+            <w:tcW w:w="3120" w:type="dxa"/>
+          </w:tcPr>
+          <w:p>
+            <w:pPr/>
+            <w:r>
+              <w:t xml:space="preserve">13.5 ppb</w:t>
+            </w:r>
+          </w:p>
+        </w:tc>
+      </w:tr>
+      <w:tr>
+        <w:tc>
+          <w:tcPr>
+            <w:tcW w:w="3120" w:type="dxa"/>
+          </w:tcPr>
+          <w:p>
+            <w:pPr/>
+            <w:r>
+              <w:t xml:space="preserve">% de la población sobre la norma anual de PM2.5 (10 µg/m³)</w:t>
+            </w:r>
+          </w:p>
+        </w:tc>
+        <w:tc>
+          <w:tcPr>
+            <w:tcW w:w="3120" w:type="dxa"/>
+          </w:tcPr>
+          <w:p>
+            <w:pPr/>
+            <w:r>
+              <w:t xml:space="preserve">100%</w:t>
+            </w:r>
+          </w:p>
+        </w:tc>
+        <w:tc>
+          <w:tcPr>
+            <w:tcW w:w="3120" w:type="dxa"/>
+          </w:tcPr>
+          <w:p>
+            <w:pPr/>
+            <w:r>
+              <w:t xml:space="preserve">100%</w:t>
+            </w:r>
+          </w:p>
+        </w:tc>
+      </w:tr>
+      <w:tr>
+        <w:tc>
+          <w:tcPr>
+            <w:tcW w:w="3120" w:type="dxa"/>
+          </w:tcPr>
+          <w:p>
+            <w:pPr/>
+            <w:r>
+              <w:t xml:space="preserve">% de la población a ≤ 5 km de una estación de ozono</w:t>
+            </w:r>
+          </w:p>
+        </w:tc>
+        <w:tc>
+          <w:tcPr>
+            <w:tcW w:w="3120" w:type="dxa"/>
+          </w:tcPr>
+          <w:p>
+            <w:pPr/>
+            <w:r>
+              <w:t xml:space="preserve">97.7%</w:t>
+            </w:r>
+          </w:p>
+        </w:tc>
+        <w:tc>
+          <w:tcPr>
+            <w:tcW w:w="3120" w:type="dxa"/>
+          </w:tcPr>
+          <w:p>
+            <w:pPr/>
+            <w:r>
+              <w:t xml:space="preserve">40.5%</w:t>
+            </w:r>
+          </w:p>
+        </w:tc>
+      </w:tr>
+      <w:tr>
+        <w:tc>
+          <w:tcPr>
+            <w:tcW w:w="3120" w:type="dxa"/>
+          </w:tcPr>
+          <w:p>
+            <w:pPr/>
+            <w:r>
+              <w:t xml:space="preserve">Días al año con ozono &gt; 90 ppb (población cubierta)</w:t>
+            </w:r>
+          </w:p>
+        </w:tc>
+        <w:tc>
+          <w:tcPr>
+            <w:tcW w:w="3120" w:type="dxa"/>
+          </w:tcPr>
+          <w:p>
+            <w:pPr/>
+            <w:r>
+              <w:t xml:space="preserve">126</w:t>
+            </w:r>
+          </w:p>
+        </w:tc>
+        <w:tc>
+          <w:tcPr>
+            <w:tcW w:w="3120" w:type="dxa"/>
+          </w:tcPr>
+          <w:p>
+            <w:pPr/>
+            <w:r>
+              <w:t xml:space="preserve">65</w:t>
+            </w:r>
+          </w:p>
+        </w:tc>
+      </w:tr>
+    </w:tbl>
+    <w:p>
+      <w:pPr>
+        <w:pStyle w:val="ListParagraph"/>
+        <w:numPr>
+          <w:ilvl w:val="0"/>
+          <w:numId w:val="18"/>
+        </w:numPr>
+      </w:pPr>
+      <w:r>
+        <w:rPr>
+          <w:b/>
+        </w:rPr>
+        <w:t xml:space="preserve">La red de monitoreo deja fuera a casi 60% de la población del Estado de México:</w:t>
+      </w:r>
+      <w:r>
+        <w:t xml:space="preserve"> más de 10 millones de personas sin una estación a 5 km.</w:t>
+      </w:r>
+    </w:p>
+    <w:p>
+      <w:pPr>
+        <w:pStyle w:val="ListParagraph"/>
+        <w:numPr>
+          <w:ilvl w:val="0"/>
+          <w:numId w:val="18"/>
+        </w:numPr>
+      </w:pPr>
+      <w:r>
+        <w:rPr>
+          <w:b/>
+        </w:rPr>
+        <w:t xml:space="preserve">4.45 millones de personas</w:t>
+      </w:r>
+      <w:r>
+        <w:t xml:space="preserve"> (28% de la población cubierta) viven cerca de una estación con más de 120 días al año sobre la norma de ozono. Entre ellas hay 733 mil niños de 0 a 14 años, 534 mil adultos de 65 o más y 1.15 millones de personas sin derechohabiencia. Todas viven en la CDMX.</w:t>
+      </w:r>
+    </w:p>
+    <w:p>
+      <w:pPr>
+        <w:pStyle w:val="Heading3"/>
+      </w:pPr>
+      <w:r>
+        <w:t xml:space="preserve">7.14 Mapa: localidades y estaciones</w:t>
+      </w:r>
+    </w:p>
+    <w:p>
+      <w:pPr/>
+      <w:r>
+        <w:drawing>
+          <wp:inline distT="0" distB="0" distL="0" distR="0">
+            <wp:extent cx="5486400" cy="2577440"/>
+            <wp:docPr id="10" name="image10" descr="Localidades del censo y estaciones de la RAMA"/>
+            <a:graphic xmlns:a="http://schemas.openxmlformats.org/drawingml/2006/main">
+              <a:graphicData uri="http://schemas.openxmlformats.org/drawingml/2006/picture">
+                <pic:pic xmlns:pic="http://schemas.openxmlformats.org/drawingml/2006/picture">
+                  <pic:nvPicPr>
+                    <pic:cNvPr id="10" name="image10" descr="Localidades del censo y estaciones de la RAMA"/>
+                    <pic:cNvPicPr/>
+                  </pic:nvPicPr>
+                  <pic:blipFill>
+                    <a:blip r:embed="rId21"/>
+                    <a:stretch>
+                      <a:fillRect/>
+                    </a:stretch>
+                  </pic:blipFill>
+                  <pic:spPr>
+                    <a:xfrm>
+                      <a:off x="0" y="0"/>
+                      <a:ext cx="5486400" cy="2577440"/>
+                    </a:xfrm>
+                    <a:prstGeom prst="rect">
+                      <a:avLst/>
+                    </a:prstGeom>
+                  </pic:spPr>
+                </pic:pic>
+              </a:graphicData>
+            </a:graphic>
+          </wp:inline>
+        </w:drawing>
+      </w:r>
+    </w:p>
+    <w:p>
+      <w:pPr>
+        <w:pStyle w:val="ListParagraph"/>
+        <w:numPr>
+          <w:ilvl w:val="0"/>
+          <w:numId w:val="19"/>
+        </w:numPr>
+      </w:pPr>
+      <w:r>
+        <w:rPr>
+          <w:b/>
+        </w:rPr>
+        <w:t xml:space="preserve">El gradiente norte-sur es opuesto para los dos contaminantes.</w:t>
+      </w:r>
+      <w:r>
+        <w:t xml:space="preserve"> El PM2.5 es mayor en las estaciones del norte (Spearman con la latitud = 0.61); Xalostoc tiene 59 días al año sobre la norma. El ozono es mayor en el sur (−0.62): Pedregal, el Centro de Ciencias de la Atmósfera y Coyoacán pasan de 159 días al año, y Acolman y Xalostoc tienen 32.</w:t>
+      </w:r>
+    </w:p>
+    <w:p>
+      <w:pPr>
+        <w:pStyle w:val="ListParagraph"/>
+        <w:numPr>
+          <w:ilvl w:val="0"/>
+          <w:numId w:val="19"/>
+        </w:numPr>
+      </w:pPr>
+      <w:r>
+        <w:t xml:space="preserve">La explicación: los precursores se emiten en el centro y norte, el viento los lleva al sur y en la tarde se convierten en ozono. Quien vive en el sur respira el ozono que se formó con emisiones del norte.</w:t>
+      </w:r>
+    </w:p>
+    <w:p>
+      <w:pPr>
+        <w:pStyle w:val="Heading3"/>
+      </w:pPr>
+      <w:r>
+        <w:t xml:space="preserve">7.15 Exposición según nivel socioeconómico</w:t>
+      </w:r>
+    </w:p>
+    <w:p>
+      <w:pPr/>
+      <w:r>
+        <w:drawing>
+          <wp:inline distT="0" distB="0" distL="0" distR="0">
+            <wp:extent cx="5486400" cy="1511692"/>
+            <wp:docPr id="11" name="image11" descr="Exposición según quintil de escolaridad"/>
+            <a:graphic xmlns:a="http://schemas.openxmlformats.org/drawingml/2006/main">
+              <a:graphicData uri="http://schemas.openxmlformats.org/drawingml/2006/picture">
+                <pic:pic xmlns:pic="http://schemas.openxmlformats.org/drawingml/2006/picture">
+                  <pic:nvPicPr>
+                    <pic:cNvPr id="11" name="image11" descr="Exposición según quintil de escolaridad"/>
+                    <pic:cNvPicPr/>
+                  </pic:nvPicPr>
+                  <pic:blipFill>
+                    <a:blip r:embed="rId22"/>
+                    <a:stretch>
+                      <a:fillRect/>
+                    </a:stretch>
+                  </pic:blipFill>
+                  <pic:spPr>
+                    <a:xfrm>
+                      <a:off x="0" y="0"/>
+                      <a:ext cx="5486400" cy="1511692"/>
+                    </a:xfrm>
+                    <a:prstGeom prst="rect">
+                      <a:avLst/>
+                    </a:prstGeom>
+                  </pic:spPr>
+                </pic:pic>
+              </a:graphicData>
+            </a:graphic>
+          </wp:inline>
+        </w:drawing>
+      </w:r>
+    </w:p>
+    <w:p>
+      <w:pPr/>
+      <w:r>
+        <w:t xml:space="preserve">Los quintiles se ponderan por población (localidades de 2,500 habitantes o más).</w:t>
+      </w:r>
+    </w:p>
+    <w:p>
+      <w:pPr>
+        <w:pStyle w:val="ListParagraph"/>
+        <w:numPr>
+          <w:ilvl w:val="0"/>
+          <w:numId w:val="20"/>
+        </w:numPr>
+      </w:pPr>
+      <w:r>
+        <w:rPr>
+          <w:b/>
+        </w:rPr>
+        <w:t xml:space="preserve">CDMX:</w:t>
+      </w:r>
+      <w:r>
+        <w:t xml:space="preserve"> el ozono aumenta con la escolaridad: 144 días al año sobre la norma en el quintil más escolarizado contra 109 en el menos escolarizado. Es el mismo gradiente norte-sur, porque las alcaldías del sur tienen más escolaridad. El NO2 también sube (12.4 → 19.1 ppb).</w:t>
+      </w:r>
+    </w:p>
+    <w:p>
+      <w:pPr>
+        <w:pStyle w:val="ListParagraph"/>
+        <w:numPr>
+          <w:ilvl w:val="0"/>
+          <w:numId w:val="20"/>
+        </w:numPr>
+      </w:pPr>
+      <w:r>
+        <w:rPr>
+          <w:b/>
+        </w:rPr>
+        <w:t xml:space="preserve">Estado de México:</w:t>
+      </w:r>
+      <w:r>
+        <w:t xml:space="preserve"> el NO2 sube con la escolaridad hasta el cuarto quintil (11.9 → 17.4 ppb), porque las localidades más escolarizadas son las urbanas. Las rurales tienen menos escolaridad y menos contaminación.</w:t>
+      </w:r>
+    </w:p>
+    <w:p>
+      <w:pPr>
+        <w:pStyle w:val="ListParagraph"/>
+        <w:numPr>
+          <w:ilvl w:val="0"/>
+          <w:numId w:val="20"/>
+        </w:numPr>
+      </w:pPr>
+      <w:r>
+        <w:rPr>
+          <w:b/>
+        </w:rPr>
+        <w:t xml:space="preserve">Limitación:</w:t>
+      </w:r>
+      <w:r>
+        <w:t xml:space="preserve"> en el censo, nueve alcaldías de la CDMX son una sola localidad gigante, así que estos quintiles tienen poco detalle. El análisis por AGEB del EDA anterior es la forma de afinarlo.</w:t>
+      </w:r>
+    </w:p>
+    <w:p>
+      <w:pPr>
+        <w:pStyle w:val="Heading2"/>
+      </w:pPr>
+      <w:r>
+        <w:t xml:space="preserve">8. Conclusiones</w:t>
+      </w:r>
+    </w:p>
+    <w:p>
+      <w:pPr>
+        <w:pStyle w:val="ListParagraph"/>
+        <w:numPr>
+          <w:ilvl w:val="0"/>
+          <w:numId w:val="21"/>
+        </w:numPr>
+      </w:pPr>
+      <w:r>
+        <w:rPr>
+          <w:b/>
+        </w:rPr>
+        <w:t xml:space="preserve">Se construyeron dos datasets unidos por las estaciones.</w:t>
+      </w:r>
+      <w:r>
+        <w:t xml:space="preserve"> El diario (3,653 días × 37 variables) sale de 24.8 millones de registros horarios del SIMAT con dos formatos de archivo. El de localidades (5,085 × 32) une el censo y el satélite del EDA anterior con la estación RAMA más cercana. Se documentó un problema que el archivo no declara: el viento de 2024.</w:t>
+      </w:r>
+    </w:p>
+    <w:p>
+      <w:pPr>
+        <w:pStyle w:val="ListParagraph"/>
+        <w:numPr>
+          <w:ilvl w:val="0"/>
+          <w:numId w:val="21"/>
+        </w:numPr>
+      </w:pPr>
+      <w:r>
+        <w:rPr>
+          <w:b/>
+        </w:rPr>
+        <w:t xml:space="preserve">La mala calidad del aire es cotidiana:</w:t>
+      </w:r>
+      <w:r>
+        <w:t xml:space="preserve"> el 75% de los días supera la guía de la OMS para PM2.5, y en el 66% de los días alguna estación rebasa la norma de ozono (90% en abril y mayo).</w:t>
+      </w:r>
+    </w:p>
+    <w:p>
+      <w:pPr>
+        <w:pStyle w:val="ListParagraph"/>
+        <w:numPr>
+          <w:ilvl w:val="0"/>
+          <w:numId w:val="21"/>
+        </w:numPr>
+      </w:pPr>
+      <w:r>
+        <w:rPr>
+          <w:b/>
+        </w:rPr>
+        <w:t xml:space="preserve">El PM2.5 mejoró desde 2020; el ozono no.</w:t>
+      </w:r>
+      <w:r>
+        <w:t xml:space="preserve"> En el confinamiento, el CO y el NO2 bajaron 30-40% y el ozono solo 4.5%.</w:t>
+      </w:r>
+    </w:p>
+    <w:p>
+      <w:pPr>
+        <w:pStyle w:val="ListParagraph"/>
+        <w:numPr>
+          <w:ilvl w:val="0"/>
+          <w:numId w:val="21"/>
+        </w:numPr>
+      </w:pPr>
+      <w:r>
+        <w:rPr>
+          <w:b/>
+        </w:rPr>
+        <w:t xml:space="preserve">La meteorología explica gran parte de la variación diaria.</w:t>
+      </w:r>
+      <w:r>
+        <w:t xml:space="preserve"> Un modelo lineal simple explica 59-66% del ozono y 54% del PM2.5 en años que no vio. Las relaciones no son lineales y hay autocorrelación, así que se necesita partición temporal y modelos no lineales.</w:t>
+      </w:r>
+    </w:p>
+    <w:p>
+      <w:pPr>
+        <w:pStyle w:val="ListParagraph"/>
+        <w:numPr>
+          <w:ilvl w:val="0"/>
+          <w:numId w:val="21"/>
+        </w:numPr>
+      </w:pPr>
+      <w:r>
+        <w:rPr>
+          <w:b/>
+        </w:rPr>
+        <w:t xml:space="preserve">El satélite de NO2 coincide con las estaciones (ρ = 0.89); el de PM2.5 no (ρ = 0.08).</w:t>
+      </w:r>
+      <w:r>
+        <w:t xml:space="preserve"> Los contrastes espaciales de PM2.5 satelital del EDA anterior deben tomarse con cautela.</w:t>
+      </w:r>
+    </w:p>
+    <w:p>
+      <w:pPr>
+        <w:pStyle w:val="ListParagraph"/>
+        <w:numPr>
+          <w:ilvl w:val="0"/>
+          <w:numId w:val="21"/>
+        </w:numPr>
+      </w:pPr>
+      <w:r>
+        <w:rPr>
+          <w:b/>
+        </w:rPr>
+        <w:t xml:space="preserve">El gradiente norte-sur es opuesto:</w:t>
+      </w:r>
+      <w:r>
+        <w:t xml:space="preserve"> más PM2.5 en el norte y más ozono en el sur. 4.45 millones de personas, incluidos 733 mil niños y 534 mil adultos mayores, viven cerca de una estación con más de 120 días al año sobre la norma de ozono.</w:t>
+      </w:r>
+    </w:p>
+    <w:p>
+      <w:pPr>
+        <w:pStyle w:val="ListParagraph"/>
+        <w:numPr>
+          <w:ilvl w:val="0"/>
+          <w:numId w:val="21"/>
+        </w:numPr>
+      </w:pPr>
+      <w:r>
+        <w:rPr>
+          <w:b/>
+        </w:rPr>
+        <w:t xml:space="preserve">La red de monitoreo deja sin estación cercana a casi 60% de la población del Estado de México.</w:t>
+      </w:r>
+    </w:p>
+    <w:p>
+      <w:pPr/>
+      <w:r>
+        <w:rPr>
+          <w:b/>
+        </w:rPr>
+        <w:t xml:space="preserve">Siguiente etapa:</w:t>
+      </w:r>
+      <w:r>
+        <w:t xml:space="preserve"> regresión polinomial y robusta (Huber, por los eventos extremos), redes neuronales y clasificación de los días que rebasan la norma. Unir las dos partes: usar el modelo diario para estimar los días sobre la norma en las localidades sin estación, con el satélite de NO2 como guía espacial. Agregar la altura de la capa de mezcla y la radiación solar (ERA5), y el análisis por AGEB del EDA anterior.</w:t>
+      </w:r>
+    </w:p>
+    <w:p>
+      <w:pPr/>
+      <w:r>
+        <w:rPr>
+          <w:b/>
+        </w:rPr>
+        <w:t xml:space="preserve">Limitaciones:</w:t>
+      </w:r>
+    </w:p>
+    <w:p>
+      <w:pPr>
+        <w:pStyle w:val="ListParagraph"/>
+        <w:numPr>
+          <w:ilvl w:val="0"/>
+          <w:numId w:val="22"/>
+        </w:numPr>
+      </w:pPr>
+      <w:r>
+        <w:t xml:space="preserve">Se usa la meteorología observada del mismo día; un pronóstico real usaría la pronosticada.</w:t>
+      </w:r>
+    </w:p>
+    <w:p>
+      <w:pPr>
+        <w:pStyle w:val="ListParagraph"/>
+        <w:numPr>
+          <w:ilvl w:val="0"/>
+          <w:numId w:val="22"/>
+        </w:numPr>
+      </w:pPr>
+      <w:r>
+        <w:t xml:space="preserve">El promedio entre estaciones mezcla zonas distintas de la ciudad, y el número de estaciones cambia con los años.</w:t>
+      </w:r>
+    </w:p>
+    <w:p>
+      <w:pPr>
+        <w:pStyle w:val="ListParagraph"/>
+        <w:numPr>
+          <w:ilvl w:val="0"/>
+          <w:numId w:val="22"/>
+        </w:numPr>
+      </w:pPr>
+      <w:r>
+        <w:t xml:space="preserve">El satélite es de un solo año (2020, con efecto de la pandemia).</w:t>
+      </w:r>
+    </w:p>
+    <w:p>
+      <w:pPr>
+        <w:pStyle w:val="ListParagraph"/>
+        <w:numPr>
+          <w:ilvl w:val="0"/>
+          <w:numId w:val="22"/>
+        </w:numPr>
+      </w:pPr>
+      <w:r>
+        <w:t xml:space="preserve">Las correlaciones con el censo son ecológicas (por localidad), no individuales.</w:t>
+      </w:r>
+    </w:p>
+    <w:p>
+      <w:pPr>
+        <w:pStyle w:val="ListParagraph"/>
+        <w:numPr>
+          <w:ilvl w:val="0"/>
+          <w:numId w:val="22"/>
         </w:numPr>
       </w:pPr>
       <w:r>
@@ -5344,7 +7065,7 @@
               <w:rPr>
                 <w:rStyle w:val="CodeChar"/>
               </w:rPr>
-              <w:t xml:space="preserve">EDA_entrega1_RAMA.ipynb</w:t>
+              <w:t xml:space="preserve">EDA_entrega1.ipynb</w:t>
             </w:r>
           </w:p>
         </w:tc>
@@ -5355,7 +7076,7 @@
           <w:p>
             <w:pPr/>
             <w:r>
-              <w:t xml:space="preserve">Notebook completo (Colab o local)</w:t>
+              <w:t xml:space="preserve">Notebook completo, partes A y B (Colab o local)</w:t>
             </w:r>
           </w:p>
         </w:tc>
@@ -5398,6 +7119,60 @@
               <w:rPr>
                 <w:rStyle w:val="CodeChar"/>
               </w:rPr>
+              <w:t xml:space="preserve">datos/inegi_loc.csv</w:t>
+            </w:r>
+            <w:r>
+              <w:t xml:space="preserve">, </w:t>
+            </w:r>
+            <w:r>
+              <w:rPr>
+                <w:rStyle w:val="CodeChar"/>
+              </w:rPr>
+              <w:t xml:space="preserve">datos/cont_loc_mean.csv</w:t>
+            </w:r>
+            <w:r>
+              <w:t xml:space="preserve">, </w:t>
+            </w:r>
+            <w:r>
+              <w:rPr>
+                <w:rStyle w:val="CodeChar"/>
+              </w:rPr>
+              <w:t xml:space="preserve">datos/*_satelite_2020.nc</w:t>
+            </w:r>
+            <w:r>
+              <w:t xml:space="preserve">, </w:t>
+            </w:r>
+            <w:r>
+              <w:rPr>
+                <w:rStyle w:val="CodeChar"/>
+              </w:rPr>
+              <w:t xml:space="preserve">datos/municipios_cdmx_edomex.gpkg</w:t>
+            </w:r>
+          </w:p>
+        </w:tc>
+        <w:tc>
+          <w:tcPr>
+            <w:tcW w:w="4680" w:type="dxa"/>
+          </w:tcPr>
+          <w:p>
+            <w:pPr/>
+            <w:r>
+              <w:t xml:space="preserve">Datos del EDA anterior</w:t>
+            </w:r>
+          </w:p>
+        </w:tc>
+      </w:tr>
+      <w:tr>
+        <w:tc>
+          <w:tcPr>
+            <w:tcW w:w="4680" w:type="dxa"/>
+          </w:tcPr>
+          <w:p>
+            <w:pPr/>
+            <w:r>
+              <w:rPr>
+                <w:rStyle w:val="CodeChar"/>
+              </w:rPr>
               <w:t xml:space="preserve">datos/dataset_final_diario.csv</w:t>
             </w:r>
           </w:p>
@@ -5409,7 +7184,7 @@
           <w:p>
             <w:pPr/>
             <w:r>
-              <w:t xml:space="preserve">Dataset final: 3,653 días × 37 variables</w:t>
+              <w:t xml:space="preserve">Dataset diario: 3,653 días × 37 variables</w:t>
             </w:r>
           </w:p>
         </w:tc>
@@ -5425,6 +7200,60 @@
               <w:rPr>
                 <w:rStyle w:val="CodeChar"/>
               </w:rPr>
+              <w:t xml:space="preserve">datos/dataset_localidades.csv</w:t>
+            </w:r>
+          </w:p>
+        </w:tc>
+        <w:tc>
+          <w:tcPr>
+            <w:tcW w:w="4680" w:type="dxa"/>
+          </w:tcPr>
+          <w:p>
+            <w:pPr/>
+            <w:r>
+              <w:t xml:space="preserve">Dataset por localidad: 5,085 × 32</w:t>
+            </w:r>
+          </w:p>
+        </w:tc>
+      </w:tr>
+      <w:tr>
+        <w:tc>
+          <w:tcPr>
+            <w:tcW w:w="4680" w:type="dxa"/>
+          </w:tcPr>
+          <w:p>
+            <w:pPr/>
+            <w:r>
+              <w:rPr>
+                <w:rStyle w:val="CodeChar"/>
+              </w:rPr>
+              <w:t xml:space="preserve">datos/resumen_estaciones.csv</w:t>
+            </w:r>
+          </w:p>
+        </w:tc>
+        <w:tc>
+          <w:tcPr>
+            <w:tcW w:w="4680" w:type="dxa"/>
+          </w:tcPr>
+          <w:p>
+            <w:pPr/>
+            <w:r>
+              <w:t xml:space="preserve">Resumen por estación</w:t>
+            </w:r>
+          </w:p>
+        </w:tc>
+      </w:tr>
+      <w:tr>
+        <w:tc>
+          <w:tcPr>
+            <w:tcW w:w="4680" w:type="dxa"/>
+          </w:tcPr>
+          <w:p>
+            <w:pPr/>
+            <w:r>
+              <w:rPr>
+                <w:rStyle w:val="CodeChar"/>
+              </w:rPr>
               <w:t xml:space="preserve">datos/diccionario_dataset_diario.csv</w:t>
             </w:r>
           </w:p>
@@ -5436,7 +7265,7 @@
           <w:p>
             <w:pPr/>
             <w:r>
-              <w:t xml:space="preserve">Descripción de cada variable</w:t>
+              <w:t xml:space="preserve">Descripción de cada variable del dataset diario</w:t>
             </w:r>
           </w:p>
         </w:tc>
@@ -5685,10 +7514,7 @@
     <w:abstractNumId w:val="0"/>
   </w:num>
   <w:num w:numId="4">
-    <w:abstractNumId w:val="1"/>
-    <w:lvlOverride w:ilvl="0">
-      <w:startOverride w:val="1"/>
-    </w:lvlOverride>
+    <w:abstractNumId w:val="0"/>
   </w:num>
   <w:num w:numId="5">
     <w:abstractNumId w:val="1"/>
@@ -5697,13 +7523,19 @@
     </w:lvlOverride>
   </w:num>
   <w:num w:numId="6">
-    <w:abstractNumId w:val="0"/>
+    <w:abstractNumId w:val="1"/>
+    <w:lvlOverride w:ilvl="0">
+      <w:startOverride w:val="1"/>
+    </w:lvlOverride>
   </w:num>
   <w:num w:numId="7">
     <w:abstractNumId w:val="0"/>
   </w:num>
   <w:num w:numId="8">
-    <w:abstractNumId w:val="0"/>
+    <w:abstractNumId w:val="1"/>
+    <w:lvlOverride w:ilvl="0">
+      <w:startOverride w:val="1"/>
+    </w:lvlOverride>
   </w:num>
   <w:num w:numId="9">
     <w:abstractNumId w:val="0"/>
@@ -5724,12 +7556,30 @@
     <w:abstractNumId w:val="0"/>
   </w:num>
   <w:num w:numId="15">
+    <w:abstractNumId w:val="0"/>
+  </w:num>
+  <w:num w:numId="16">
+    <w:abstractNumId w:val="0"/>
+  </w:num>
+  <w:num w:numId="17">
+    <w:abstractNumId w:val="0"/>
+  </w:num>
+  <w:num w:numId="18">
+    <w:abstractNumId w:val="0"/>
+  </w:num>
+  <w:num w:numId="19">
+    <w:abstractNumId w:val="0"/>
+  </w:num>
+  <w:num w:numId="20">
+    <w:abstractNumId w:val="0"/>
+  </w:num>
+  <w:num w:numId="21">
     <w:abstractNumId w:val="1"/>
     <w:lvlOverride w:ilvl="0">
       <w:startOverride w:val="1"/>
     </w:lvlOverride>
   </w:num>
-  <w:num w:numId="16">
+  <w:num w:numId="22">
     <w:abstractNumId w:val="0"/>
   </w:num>
 </w:numbering>

</xml_diff>